<commit_message>
changement dans neutre et debut anglais
</commit_message>
<xml_diff>
--- a/Rapports_mensuels/Mois2026_08/ipc_note_08_ar_2026_08.docx
+++ b/Rapports_mensuels/Mois2026_08/ipc_note_08_ar_2026_08.docx
@@ -475,6 +475,546 @@
       </w:r>
       <w:r>
         <w:t xml:space="preserve">ب0,4% ‏ و كذا</w:t>
+      </w:r>
+      <w:r>
+        <w:t xml:space="preserve"> </w:t>
+      </w:r>
+      <w:r>
+        <w:t xml:space="preserve">استقرار أثمان NA فإن ذلك لم يؤثر على التطور</w:t>
+      </w:r>
+      <w:r>
+        <w:t xml:space="preserve"> </w:t>
+      </w:r>
+      <w:r>
+        <w:t xml:space="preserve">العام. ارتفع الرقم الاستدلالي للمواد الغذائية</w:t>
+      </w:r>
+      <w:r>
+        <w:t xml:space="preserve"> </w:t>
+      </w:r>
+      <w:r>
+        <w:t xml:space="preserve">ب -2.9% في نونبر 2025 مقارنة بنظيره من السنة الماضية،ويعزى ذلك إلى زيادة أثمان المواد المكونة للمجموعات التالية:</w:t>
+      </w:r>
+      <w:r>
+        <w:t xml:space="preserve"> </w:t>
+      </w:r>
+      <w:r>
+        <w:rPr>
+          <w:b/>
+          <w:bCs/>
+        </w:rPr>
+        <w:t xml:space="preserve">اللحم</w:t>
+      </w:r>
+      <w:r>
+        <w:t xml:space="preserve">ب6,9% ‏،</w:t>
+      </w:r>
+      <w:r>
+        <w:t xml:space="preserve"> </w:t>
+      </w:r>
+      <w:r>
+        <w:rPr>
+          <w:b/>
+          <w:bCs/>
+        </w:rPr>
+        <w:t xml:space="preserve">التبغ</w:t>
+      </w:r>
+      <w:r>
+        <w:t xml:space="preserve">ب4,0% ‏،</w:t>
+      </w:r>
+      <w:r>
+        <w:t xml:space="preserve"> </w:t>
+      </w:r>
+      <w:r>
+        <w:rPr>
+          <w:b/>
+          <w:bCs/>
+        </w:rPr>
+        <w:t xml:space="preserve">السكر، والمربى، والعسل، والشوكولاتة، والحلويات</w:t>
+      </w:r>
+      <w:r>
+        <w:t xml:space="preserve">ب2,1% ‏،</w:t>
+      </w:r>
+      <w:r>
+        <w:t xml:space="preserve"> </w:t>
+      </w:r>
+      <w:r>
+        <w:rPr>
+          <w:b/>
+          <w:bCs/>
+        </w:rPr>
+        <w:t xml:space="preserve">مقهى، شاي وكاكاو</w:t>
+      </w:r>
+      <w:r>
+        <w:t xml:space="preserve">ب0,6% ‏ و</w:t>
+      </w:r>
+      <w:r>
+        <w:t xml:space="preserve"> </w:t>
+      </w:r>
+      <w:r>
+        <w:rPr>
+          <w:b/>
+          <w:bCs/>
+        </w:rPr>
+        <w:t xml:space="preserve">المياه المعدنية، والمشروبات الغازية، وعصائر الفاكهة والخضراوات (بدون تاريخ)</w:t>
+      </w:r>
+      <w:r>
+        <w:t xml:space="preserve">ب0,4% ‏. وعلى الرغم من الانخفاضات المسجلة في أثمان المواد</w:t>
+      </w:r>
+      <w:r>
+        <w:t xml:space="preserve"> </w:t>
+      </w:r>
+      <w:r>
+        <w:t xml:space="preserve">المكونة للمجموعات التالية:</w:t>
+      </w:r>
+      <w:r>
+        <w:t xml:space="preserve"> </w:t>
+      </w:r>
+      <w:r>
+        <w:rPr>
+          <w:b/>
+          <w:bCs/>
+        </w:rPr>
+        <w:t xml:space="preserve">الزيوت والدهون</w:t>
+      </w:r>
+      <w:r>
+        <w:t xml:space="preserve">ب18,3% ‏،</w:t>
+      </w:r>
+      <w:r>
+        <w:t xml:space="preserve"> </w:t>
+      </w:r>
+      <w:r>
+        <w:rPr>
+          <w:b/>
+          <w:bCs/>
+        </w:rPr>
+        <w:t xml:space="preserve">الفواكه</w:t>
+      </w:r>
+      <w:r>
+        <w:t xml:space="preserve">ب8,5% ‏،</w:t>
+      </w:r>
+      <w:r>
+        <w:t xml:space="preserve"> </w:t>
+      </w:r>
+      <w:r>
+        <w:rPr>
+          <w:b/>
+          <w:bCs/>
+        </w:rPr>
+        <w:t xml:space="preserve">الخضراوات</w:t>
+      </w:r>
+      <w:r>
+        <w:t xml:space="preserve">ب5,3% ‏،</w:t>
+      </w:r>
+      <w:r>
+        <w:t xml:space="preserve"> </w:t>
+      </w:r>
+      <w:r>
+        <w:rPr>
+          <w:b/>
+          <w:bCs/>
+        </w:rPr>
+        <w:t xml:space="preserve">الحليب والجبن والبيض</w:t>
+      </w:r>
+      <w:r>
+        <w:t xml:space="preserve">ب4,8% ‏،</w:t>
+      </w:r>
+      <w:r>
+        <w:t xml:space="preserve"> </w:t>
+      </w:r>
+      <w:r>
+        <w:rPr>
+          <w:b/>
+          <w:bCs/>
+        </w:rPr>
+        <w:t xml:space="preserve">الأسماك والمأكولات البحرية</w:t>
+      </w:r>
+      <w:r>
+        <w:t xml:space="preserve">ب2,9% ‏،</w:t>
+      </w:r>
+      <w:r>
+        <w:t xml:space="preserve"> </w:t>
+      </w:r>
+      <w:r>
+        <w:rPr>
+          <w:b/>
+          <w:bCs/>
+        </w:rPr>
+        <w:t xml:space="preserve">الخبز والحبوب</w:t>
+      </w:r>
+      <w:r>
+        <w:t xml:space="preserve">ب0,3% ‏ و</w:t>
+      </w:r>
+      <w:r>
+        <w:t xml:space="preserve"> </w:t>
+      </w:r>
+      <w:r>
+        <w:rPr>
+          <w:b/>
+          <w:bCs/>
+        </w:rPr>
+        <w:t xml:space="preserve">مواد غذائية غير مصنفة في مكان آخر</w:t>
+      </w:r>
+      <w:r>
+        <w:t xml:space="preserve">ب0,1% ‏ و كذا</w:t>
+      </w:r>
+      <w:r>
+        <w:t xml:space="preserve"> </w:t>
+      </w:r>
+      <w:r>
+        <w:t xml:space="preserve">استقرار أثمان NA فإن ذلك لم يؤثر على التطور</w:t>
+      </w:r>
+      <w:r>
+        <w:t xml:space="preserve"> </w:t>
+      </w:r>
+      <w:r>
+        <w:t xml:space="preserve">العام. ارتفع الرقم الاستدلالي للمواد الغذائية</w:t>
+      </w:r>
+      <w:r>
+        <w:t xml:space="preserve"> </w:t>
+      </w:r>
+      <w:r>
+        <w:t xml:space="preserve">ب -2.9% في نونبر 2025 مقارنة بنظيره من السنة الماضية،ويعزى ذلك إلى زيادة أثمان المواد المكونة للمجموعات التالية:</w:t>
+      </w:r>
+      <w:r>
+        <w:t xml:space="preserve"> </w:t>
+      </w:r>
+      <w:r>
+        <w:rPr>
+          <w:b/>
+          <w:bCs/>
+        </w:rPr>
+        <w:t xml:space="preserve">اللحم</w:t>
+      </w:r>
+      <w:r>
+        <w:t xml:space="preserve">ب6,9% ‏،</w:t>
+      </w:r>
+      <w:r>
+        <w:t xml:space="preserve"> </w:t>
+      </w:r>
+      <w:r>
+        <w:rPr>
+          <w:b/>
+          <w:bCs/>
+        </w:rPr>
+        <w:t xml:space="preserve">التبغ</w:t>
+      </w:r>
+      <w:r>
+        <w:t xml:space="preserve">ب4,0% ‏،</w:t>
+      </w:r>
+      <w:r>
+        <w:t xml:space="preserve"> </w:t>
+      </w:r>
+      <w:r>
+        <w:rPr>
+          <w:b/>
+          <w:bCs/>
+        </w:rPr>
+        <w:t xml:space="preserve">السكر، والمربى، والعسل، والشوكولاتة، والحلويات</w:t>
+      </w:r>
+      <w:r>
+        <w:t xml:space="preserve">ب2,1% ‏،</w:t>
+      </w:r>
+      <w:r>
+        <w:t xml:space="preserve"> </w:t>
+      </w:r>
+      <w:r>
+        <w:rPr>
+          <w:b/>
+          <w:bCs/>
+        </w:rPr>
+        <w:t xml:space="preserve">مقهى، شاي وكاكاو</w:t>
+      </w:r>
+      <w:r>
+        <w:t xml:space="preserve">ب0,6% ‏ و</w:t>
+      </w:r>
+      <w:r>
+        <w:t xml:space="preserve"> </w:t>
+      </w:r>
+      <w:r>
+        <w:rPr>
+          <w:b/>
+          <w:bCs/>
+        </w:rPr>
+        <w:t xml:space="preserve">المياه المعدنية، والمشروبات الغازية، وعصائر الفاكهة والخضراوات (بدون تاريخ)</w:t>
+      </w:r>
+      <w:r>
+        <w:t xml:space="preserve">ب0,4% ‏. وعلى الرغم من الانخفاضات المسجلة في أثمان المواد</w:t>
+      </w:r>
+      <w:r>
+        <w:t xml:space="preserve"> </w:t>
+      </w:r>
+      <w:r>
+        <w:t xml:space="preserve">المكونة للمجموعات التالية:</w:t>
+      </w:r>
+      <w:r>
+        <w:t xml:space="preserve"> </w:t>
+      </w:r>
+      <w:r>
+        <w:rPr>
+          <w:b/>
+          <w:bCs/>
+        </w:rPr>
+        <w:t xml:space="preserve">الزيوت والدهون</w:t>
+      </w:r>
+      <w:r>
+        <w:t xml:space="preserve">ب18,3% ‏،</w:t>
+      </w:r>
+      <w:r>
+        <w:t xml:space="preserve"> </w:t>
+      </w:r>
+      <w:r>
+        <w:rPr>
+          <w:b/>
+          <w:bCs/>
+        </w:rPr>
+        <w:t xml:space="preserve">الفواكه</w:t>
+      </w:r>
+      <w:r>
+        <w:t xml:space="preserve">ب8,5% ‏،</w:t>
+      </w:r>
+      <w:r>
+        <w:t xml:space="preserve"> </w:t>
+      </w:r>
+      <w:r>
+        <w:rPr>
+          <w:b/>
+          <w:bCs/>
+        </w:rPr>
+        <w:t xml:space="preserve">الخضراوات</w:t>
+      </w:r>
+      <w:r>
+        <w:t xml:space="preserve">ب5,3% ‏،</w:t>
+      </w:r>
+      <w:r>
+        <w:t xml:space="preserve"> </w:t>
+      </w:r>
+      <w:r>
+        <w:rPr>
+          <w:b/>
+          <w:bCs/>
+        </w:rPr>
+        <w:t xml:space="preserve">الحليب والجبن والبيض</w:t>
+      </w:r>
+      <w:r>
+        <w:t xml:space="preserve">ب4,8% ‏،</w:t>
+      </w:r>
+      <w:r>
+        <w:t xml:space="preserve"> </w:t>
+      </w:r>
+      <w:r>
+        <w:rPr>
+          <w:b/>
+          <w:bCs/>
+        </w:rPr>
+        <w:t xml:space="preserve">الأسماك والمأكولات البحرية</w:t>
+      </w:r>
+      <w:r>
+        <w:t xml:space="preserve">ب2,9% ‏،</w:t>
+      </w:r>
+      <w:r>
+        <w:t xml:space="preserve"> </w:t>
+      </w:r>
+      <w:r>
+        <w:rPr>
+          <w:b/>
+          <w:bCs/>
+        </w:rPr>
+        <w:t xml:space="preserve">الخبز والحبوب</w:t>
+      </w:r>
+      <w:r>
+        <w:t xml:space="preserve">ب0,3% ‏ و</w:t>
+      </w:r>
+      <w:r>
+        <w:t xml:space="preserve"> </w:t>
+      </w:r>
+      <w:r>
+        <w:rPr>
+          <w:b/>
+          <w:bCs/>
+        </w:rPr>
+        <w:t xml:space="preserve">مواد غذائية غير مصنفة في مكان آخر</w:t>
+      </w:r>
+      <w:r>
+        <w:t xml:space="preserve">ب0,1% ‏ و كذا</w:t>
+      </w:r>
+      <w:r>
+        <w:t xml:space="preserve"> </w:t>
+      </w:r>
+      <w:r>
+        <w:t xml:space="preserve">استقرار أثمان NA فإن ذلك لم يؤثر على التطور</w:t>
+      </w:r>
+      <w:r>
+        <w:t xml:space="preserve"> </w:t>
+      </w:r>
+      <w:r>
+        <w:t xml:space="preserve">العام. ارتفع الرقم الاستدلالي للمواد الغذائية</w:t>
+      </w:r>
+      <w:r>
+        <w:t xml:space="preserve"> </w:t>
+      </w:r>
+      <w:r>
+        <w:t xml:space="preserve">ب -2.9% في نونبر 2025 مقارنة بنظيره من السنة الماضية،ويعزى ذلك إلى زيادة أثمان المواد المكونة للمجموعات التالية:</w:t>
+      </w:r>
+      <w:r>
+        <w:t xml:space="preserve"> </w:t>
+      </w:r>
+      <w:r>
+        <w:rPr>
+          <w:b/>
+          <w:bCs/>
+        </w:rPr>
+        <w:t xml:space="preserve">اللحم</w:t>
+      </w:r>
+      <w:r>
+        <w:t xml:space="preserve">ب6,9% ‏،</w:t>
+      </w:r>
+      <w:r>
+        <w:t xml:space="preserve"> </w:t>
+      </w:r>
+      <w:r>
+        <w:rPr>
+          <w:b/>
+          <w:bCs/>
+        </w:rPr>
+        <w:t xml:space="preserve">التبغ</w:t>
+      </w:r>
+      <w:r>
+        <w:t xml:space="preserve">ب4,0% ‏،</w:t>
+      </w:r>
+      <w:r>
+        <w:t xml:space="preserve"> </w:t>
+      </w:r>
+      <w:r>
+        <w:rPr>
+          <w:b/>
+          <w:bCs/>
+        </w:rPr>
+        <w:t xml:space="preserve">السكر، والمربى، والعسل، والشوكولاتة، والحلويات</w:t>
+      </w:r>
+      <w:r>
+        <w:t xml:space="preserve">ب2,1% ‏،</w:t>
+      </w:r>
+      <w:r>
+        <w:t xml:space="preserve"> </w:t>
+      </w:r>
+      <w:r>
+        <w:rPr>
+          <w:b/>
+          <w:bCs/>
+        </w:rPr>
+        <w:t xml:space="preserve">مقهى، شاي وكاكاو</w:t>
+      </w:r>
+      <w:r>
+        <w:t xml:space="preserve">ب0,6% ‏ و</w:t>
+      </w:r>
+      <w:r>
+        <w:t xml:space="preserve"> </w:t>
+      </w:r>
+      <w:r>
+        <w:rPr>
+          <w:b/>
+          <w:bCs/>
+        </w:rPr>
+        <w:t xml:space="preserve">المياه المعدنية، والمشروبات الغازية، وعصائر الفاكهة والخضراوات (بدون تاريخ)</w:t>
+      </w:r>
+      <w:r>
+        <w:t xml:space="preserve">ب0,4% ‏. وعلى الرغم من الانخفاضات المسجلة في أثمان المواد</w:t>
+      </w:r>
+      <w:r>
+        <w:t xml:space="preserve"> </w:t>
+      </w:r>
+      <w:r>
+        <w:t xml:space="preserve">المكونة للمجموعات التالية:</w:t>
+      </w:r>
+      <w:r>
+        <w:t xml:space="preserve"> </w:t>
+      </w:r>
+      <w:r>
+        <w:rPr>
+          <w:b/>
+          <w:bCs/>
+        </w:rPr>
+        <w:t xml:space="preserve">الزيوت والدهون</w:t>
+      </w:r>
+      <w:r>
+        <w:t xml:space="preserve">ب18,3% ‏،</w:t>
+      </w:r>
+      <w:r>
+        <w:t xml:space="preserve"> </w:t>
+      </w:r>
+      <w:r>
+        <w:rPr>
+          <w:b/>
+          <w:bCs/>
+        </w:rPr>
+        <w:t xml:space="preserve">الفواكه</w:t>
+      </w:r>
+      <w:r>
+        <w:t xml:space="preserve">ب8,5% ‏،</w:t>
+      </w:r>
+      <w:r>
+        <w:t xml:space="preserve"> </w:t>
+      </w:r>
+      <w:r>
+        <w:rPr>
+          <w:b/>
+          <w:bCs/>
+        </w:rPr>
+        <w:t xml:space="preserve">الخضراوات</w:t>
+      </w:r>
+      <w:r>
+        <w:t xml:space="preserve">ب5,3% ‏،</w:t>
+      </w:r>
+      <w:r>
+        <w:t xml:space="preserve"> </w:t>
+      </w:r>
+      <w:r>
+        <w:rPr>
+          <w:b/>
+          <w:bCs/>
+        </w:rPr>
+        <w:t xml:space="preserve">الحليب والجبن والبيض</w:t>
+      </w:r>
+      <w:r>
+        <w:t xml:space="preserve">ب4,8% ‏،</w:t>
+      </w:r>
+      <w:r>
+        <w:t xml:space="preserve"> </w:t>
+      </w:r>
+      <w:r>
+        <w:rPr>
+          <w:b/>
+          <w:bCs/>
+        </w:rPr>
+        <w:t xml:space="preserve">الأسماك والمأكولات البحرية</w:t>
+      </w:r>
+      <w:r>
+        <w:t xml:space="preserve">ب2,9% ‏،</w:t>
+      </w:r>
+      <w:r>
+        <w:t xml:space="preserve"> </w:t>
+      </w:r>
+      <w:r>
+        <w:rPr>
+          <w:b/>
+          <w:bCs/>
+        </w:rPr>
+        <w:t xml:space="preserve">الخبز والحبوب</w:t>
+      </w:r>
+      <w:r>
+        <w:t xml:space="preserve">ب0,3% ‏ و</w:t>
+      </w:r>
+      <w:r>
+        <w:t xml:space="preserve"> </w:t>
+      </w:r>
+      <w:r>
+        <w:rPr>
+          <w:b/>
+          <w:bCs/>
+        </w:rPr>
+        <w:t xml:space="preserve">مواد غذائية غير مصنفة في مكان آخر</w:t>
+      </w:r>
+      <w:r>
+        <w:t xml:space="preserve">ب0,1% ‏ و كذا</w:t>
       </w:r>
       <w:r>
         <w:t xml:space="preserve"> </w:t>

</xml_diff>

<commit_message>
correction du texte arabe
</commit_message>
<xml_diff>
--- a/Rapports_mensuels/Mois2026_08/ipc_note_08_ar_2026_08.docx
+++ b/Rapports_mensuels/Mois2026_08/ipc_note_08_ar_2026_08.docx
@@ -46,7 +46,7 @@
               <w:spacing w:after="100" w:before="100" w:line="240"/>
               <w:ind w:left="100" w:right="100" w:firstLine="0" w:firstLineChars="0"/>
               <w:rPr>
-                <w:rFonts w:ascii="Arial" w:hAnsi="Arial" w:eastAsia="Arial" w:cs="Arial"/>
+                <w:rFonts w:ascii="Times New Roman" w:hAnsi="Times New Roman" w:eastAsia="Times New Roman" w:cs="Times New Roman"/>
                 <w:i w:val="false"/>
                 <w:b w:val="true"/>
                 <w:u w:val="none"/>
@@ -58,7 +58,7 @@
             </w:pPr>
             <w:r xmlns:w="http://schemas.openxmlformats.org/wordprocessingml/2006/main" xmlns:wp="http://schemas.openxmlformats.org/drawingml/2006/wordprocessingDrawing" xmlns:r="http://schemas.openxmlformats.org/officeDocument/2006/relationships" xmlns:w14="http://schemas.microsoft.com/office/word/2010/wordml">
               <w:rPr>
-                <w:rFonts w:ascii="Arial" w:hAnsi="Arial" w:eastAsia="Arial" w:cs="Arial"/>
+                <w:rFonts w:ascii="Times New Roman" w:hAnsi="Times New Roman" w:eastAsia="Times New Roman" w:cs="Times New Roman"/>
                 <w:i w:val="false"/>
                 <w:b w:val="true"/>
                 <w:u w:val="none"/>
@@ -67,7 +67,7 @@
                 <w:szCs w:val="22"/>
                 <w:color w:val="8D4354"/>
               </w:rPr>
-              <w:t xml:space="preserve">لمدينة تطوان</w:t>
+              <w:t xml:space="preserve">مدينة تطوان</w:t>
             </w:r>
           </w:p>
         </w:tc>
@@ -100,7 +100,7 @@
               <w:spacing w:after="100" w:before="100" w:line="240"/>
               <w:ind w:left="100" w:right="100" w:firstLine="0" w:firstLineChars="0"/>
               <w:rPr>
-                <w:rFonts w:ascii="Arial" w:hAnsi="Arial" w:eastAsia="Arial" w:cs="Arial"/>
+                <w:rFonts w:ascii="Times New Roman" w:hAnsi="Times New Roman" w:eastAsia="Times New Roman" w:cs="Times New Roman"/>
                 <w:i w:val="false"/>
                 <w:b w:val="true"/>
                 <w:u w:val="none"/>
@@ -112,7 +112,7 @@
             </w:pPr>
             <w:r xmlns:w="http://schemas.openxmlformats.org/wordprocessingml/2006/main" xmlns:wp="http://schemas.openxmlformats.org/drawingml/2006/wordprocessingDrawing" xmlns:r="http://schemas.openxmlformats.org/officeDocument/2006/relationships" xmlns:w14="http://schemas.microsoft.com/office/word/2010/wordml">
               <w:rPr>
-                <w:rFonts w:ascii="Arial" w:hAnsi="Arial" w:eastAsia="Arial" w:cs="Arial"/>
+                <w:rFonts w:ascii="Times New Roman" w:hAnsi="Times New Roman" w:eastAsia="Times New Roman" w:cs="Times New Roman"/>
                 <w:i w:val="false"/>
                 <w:b w:val="true"/>
                 <w:u w:val="none"/>
@@ -129,7 +129,7 @@
     </w:tbl>
     <w:p>
       <w:pPr>
-        <w:pStyle w:val="ipc_para_0"/>
+        <w:pStyle w:val="ipcpara0"/>
         <w:bidi/>
       </w:pPr>
       <w:r>
@@ -151,7 +151,7 @@
     </w:p>
     <w:p>
       <w:pPr>
-        <w:pStyle w:val="ipc_corps"/>
+        <w:pStyle w:val="ipccorps"/>
         <w:bidi/>
       </w:pPr>
       <w:r>
@@ -160,7 +160,7 @@
           <w:bCs/>
           <w:rtl/>
         </w:rPr>
-        <w:t xml:space="preserve">Sur un mois,</w:t>
+        <w:t xml:space="preserve">على المستوى الشهري،</w:t>
       </w:r>
       <w:r>
         <w:rPr>
@@ -216,6 +216,12 @@
         <w:rPr>
           <w:rtl/>
         </w:rPr>
+        <w:t xml:space="preserve"> </w:t>
+      </w:r>
+      <w:r>
+        <w:rPr>
+          <w:rtl/>
+        </w:rPr>
         <w:t xml:space="preserve">ب7,2% ‏،</w:t>
       </w:r>
       <w:r>
@@ -236,6 +242,12 @@
         <w:rPr>
           <w:rtl/>
         </w:rPr>
+        <w:t xml:space="preserve"> </w:t>
+      </w:r>
+      <w:r>
+        <w:rPr>
+          <w:rtl/>
+        </w:rPr>
         <w:t xml:space="preserve">ب5,7% ‏،</w:t>
       </w:r>
       <w:r>
@@ -256,6 +268,12 @@
         <w:rPr>
           <w:rtl/>
         </w:rPr>
+        <w:t xml:space="preserve"> </w:t>
+      </w:r>
+      <w:r>
+        <w:rPr>
+          <w:rtl/>
+        </w:rPr>
         <w:t xml:space="preserve">ب1,3% ‏،</w:t>
       </w:r>
       <w:r>
@@ -276,6 +294,12 @@
         <w:rPr>
           <w:rtl/>
         </w:rPr>
+        <w:t xml:space="preserve"> </w:t>
+      </w:r>
+      <w:r>
+        <w:rPr>
+          <w:rtl/>
+        </w:rPr>
         <w:t xml:space="preserve">ب0,9% ‏،</w:t>
       </w:r>
       <w:r>
@@ -296,6 +320,12 @@
         <w:rPr>
           <w:rtl/>
         </w:rPr>
+        <w:t xml:space="preserve"> </w:t>
+      </w:r>
+      <w:r>
+        <w:rPr>
+          <w:rtl/>
+        </w:rPr>
         <w:t xml:space="preserve">ب0,4% ‏ و</w:t>
       </w:r>
       <w:r>
@@ -311,6 +341,12 @@
           <w:rtl/>
         </w:rPr>
         <w:t xml:space="preserve">المياه المعدنية، والمشروبات الغازية، وعصائر الفاكهة والخضراوات (بدون تاريخ)</w:t>
+      </w:r>
+      <w:r>
+        <w:rPr>
+          <w:rtl/>
+        </w:rPr>
+        <w:t xml:space="preserve"> </w:t>
       </w:r>
       <w:r>
         <w:rPr>
@@ -321,7 +357,7 @@
     </w:p>
     <w:p>
       <w:pPr>
-        <w:pStyle w:val="ipc_corps"/>
+        <w:pStyle w:val="ipccorps"/>
         <w:bidi/>
       </w:pPr>
       <w:r>
@@ -348,6 +384,12 @@
         <w:rPr>
           <w:rtl/>
         </w:rPr>
+        <w:t xml:space="preserve"> </w:t>
+      </w:r>
+      <w:r>
+        <w:rPr>
+          <w:rtl/>
+        </w:rPr>
         <w:t xml:space="preserve">ب6,2% ‏،</w:t>
       </w:r>
       <w:r>
@@ -368,6 +410,12 @@
         <w:rPr>
           <w:rtl/>
         </w:rPr>
+        <w:t xml:space="preserve"> </w:t>
+      </w:r>
+      <w:r>
+        <w:rPr>
+          <w:rtl/>
+        </w:rPr>
         <w:t xml:space="preserve">ب0,9% ‏،</w:t>
       </w:r>
       <w:r>
@@ -388,6 +436,12 @@
         <w:rPr>
           <w:rtl/>
         </w:rPr>
+        <w:t xml:space="preserve"> </w:t>
+      </w:r>
+      <w:r>
+        <w:rPr>
+          <w:rtl/>
+        </w:rPr>
         <w:t xml:space="preserve">ب0,2% ‏ و</w:t>
       </w:r>
       <w:r>
@@ -408,6 +462,12 @@
         <w:rPr>
           <w:rtl/>
         </w:rPr>
+        <w:t xml:space="preserve"> </w:t>
+      </w:r>
+      <w:r>
+        <w:rPr>
+          <w:rtl/>
+        </w:rPr>
         <w:t xml:space="preserve">ب0,1% ‏ . NA NA NA ارتفع التغير الشهري للرقم الاستدلالي للمواد غير الغذائية ب (0.9% ) جراء زيادة أثمان الأقسام التالية:</w:t>
       </w:r>
       <w:r>
@@ -428,6 +488,12 @@
         <w:rPr>
           <w:rtl/>
         </w:rPr>
+        <w:t xml:space="preserve"> </w:t>
+      </w:r>
+      <w:r>
+        <w:rPr>
+          <w:rtl/>
+        </w:rPr>
         <w:t xml:space="preserve">ب6,2% ‏،</w:t>
       </w:r>
       <w:r>
@@ -448,6 +514,12 @@
         <w:rPr>
           <w:rtl/>
         </w:rPr>
+        <w:t xml:space="preserve"> </w:t>
+      </w:r>
+      <w:r>
+        <w:rPr>
+          <w:rtl/>
+        </w:rPr>
         <w:t xml:space="preserve">ب0,9% ‏،</w:t>
       </w:r>
       <w:r>
@@ -468,6 +540,12 @@
         <w:rPr>
           <w:rtl/>
         </w:rPr>
+        <w:t xml:space="preserve"> </w:t>
+      </w:r>
+      <w:r>
+        <w:rPr>
+          <w:rtl/>
+        </w:rPr>
         <w:t xml:space="preserve">ب0,2% ‏ و</w:t>
       </w:r>
       <w:r>
@@ -488,6 +566,12 @@
         <w:rPr>
           <w:rtl/>
         </w:rPr>
+        <w:t xml:space="preserve"> </w:t>
+      </w:r>
+      <w:r>
+        <w:rPr>
+          <w:rtl/>
+        </w:rPr>
         <w:t xml:space="preserve">ب0,1% ‏ . ارتفع التغير الشهري للرقم الاستدلالي للمواد غير الغذائية ب (0.9% ) جراء زيادة أثمان الأقسام التالية:</w:t>
       </w:r>
       <w:r>
@@ -508,6 +592,12 @@
         <w:rPr>
           <w:rtl/>
         </w:rPr>
+        <w:t xml:space="preserve"> </w:t>
+      </w:r>
+      <w:r>
+        <w:rPr>
+          <w:rtl/>
+        </w:rPr>
         <w:t xml:space="preserve">ب6,2% ‏،</w:t>
       </w:r>
       <w:r>
@@ -528,6 +618,12 @@
         <w:rPr>
           <w:rtl/>
         </w:rPr>
+        <w:t xml:space="preserve"> </w:t>
+      </w:r>
+      <w:r>
+        <w:rPr>
+          <w:rtl/>
+        </w:rPr>
         <w:t xml:space="preserve">ب0,9% ‏،</w:t>
       </w:r>
       <w:r>
@@ -548,6 +644,12 @@
         <w:rPr>
           <w:rtl/>
         </w:rPr>
+        <w:t xml:space="preserve"> </w:t>
+      </w:r>
+      <w:r>
+        <w:rPr>
+          <w:rtl/>
+        </w:rPr>
         <w:t xml:space="preserve">ب0,2% ‏ و</w:t>
       </w:r>
       <w:r>
@@ -563,6 +665,12 @@
           <w:rtl/>
         </w:rPr>
         <w:t xml:space="preserve">الأثاث والأدوات المنزلية والصيانة المنزلية الروتينية</w:t>
+      </w:r>
+      <w:r>
+        <w:rPr>
+          <w:rtl/>
+        </w:rPr>
+        <w:t xml:space="preserve"> </w:t>
       </w:r>
       <w:r>
         <w:rPr>
@@ -573,7 +681,7 @@
     </w:p>
     <w:p>
       <w:pPr>
-        <w:pStyle w:val="ipc_corps"/>
+        <w:pStyle w:val="ipccorps"/>
         <w:bidi/>
       </w:pPr>
       <w:r>
@@ -582,7 +690,7 @@
           <w:bCs/>
           <w:rtl/>
         </w:rPr>
-        <w:t xml:space="preserve">Sur un an,</w:t>
+        <w:t xml:space="preserve">على المستوى السنوي,</w:t>
       </w:r>
       <w:r>
         <w:rPr>
@@ -626,6 +734,12 @@
         <w:rPr>
           <w:rtl/>
         </w:rPr>
+        <w:t xml:space="preserve"> </w:t>
+      </w:r>
+      <w:r>
+        <w:rPr>
+          <w:rtl/>
+        </w:rPr>
         <w:t xml:space="preserve">ب18,3% ‏،</w:t>
       </w:r>
       <w:r>
@@ -646,6 +760,12 @@
         <w:rPr>
           <w:rtl/>
         </w:rPr>
+        <w:t xml:space="preserve"> </w:t>
+      </w:r>
+      <w:r>
+        <w:rPr>
+          <w:rtl/>
+        </w:rPr>
         <w:t xml:space="preserve">ب8,5% ‏،</w:t>
       </w:r>
       <w:r>
@@ -666,6 +786,12 @@
         <w:rPr>
           <w:rtl/>
         </w:rPr>
+        <w:t xml:space="preserve"> </w:t>
+      </w:r>
+      <w:r>
+        <w:rPr>
+          <w:rtl/>
+        </w:rPr>
         <w:t xml:space="preserve">ب5,3% ‏،</w:t>
       </w:r>
       <w:r>
@@ -686,6 +812,12 @@
         <w:rPr>
           <w:rtl/>
         </w:rPr>
+        <w:t xml:space="preserve"> </w:t>
+      </w:r>
+      <w:r>
+        <w:rPr>
+          <w:rtl/>
+        </w:rPr>
         <w:t xml:space="preserve">ب4,8% ‏،</w:t>
       </w:r>
       <w:r>
@@ -706,6 +838,12 @@
         <w:rPr>
           <w:rtl/>
         </w:rPr>
+        <w:t xml:space="preserve"> </w:t>
+      </w:r>
+      <w:r>
+        <w:rPr>
+          <w:rtl/>
+        </w:rPr>
         <w:t xml:space="preserve">ب2,9% ‏،</w:t>
       </w:r>
       <w:r>
@@ -726,6 +864,12 @@
         <w:rPr>
           <w:rtl/>
         </w:rPr>
+        <w:t xml:space="preserve"> </w:t>
+      </w:r>
+      <w:r>
+        <w:rPr>
+          <w:rtl/>
+        </w:rPr>
         <w:t xml:space="preserve">ب0,3% ‏ و</w:t>
       </w:r>
       <w:r>
@@ -746,6 +890,12 @@
         <w:rPr>
           <w:rtl/>
         </w:rPr>
+        <w:t xml:space="preserve"> </w:t>
+      </w:r>
+      <w:r>
+        <w:rPr>
+          <w:rtl/>
+        </w:rPr>
         <w:t xml:space="preserve">ب0,1% ‏. وعلى الرغم من الارتفاعات المسجلة في أثمان المواد</w:t>
       </w:r>
       <w:r>
@@ -778,6 +928,12 @@
         <w:rPr>
           <w:rtl/>
         </w:rPr>
+        <w:t xml:space="preserve"> </w:t>
+      </w:r>
+      <w:r>
+        <w:rPr>
+          <w:rtl/>
+        </w:rPr>
         <w:t xml:space="preserve">ب6,9% ‏،</w:t>
       </w:r>
       <w:r>
@@ -798,6 +954,12 @@
         <w:rPr>
           <w:rtl/>
         </w:rPr>
+        <w:t xml:space="preserve"> </w:t>
+      </w:r>
+      <w:r>
+        <w:rPr>
+          <w:rtl/>
+        </w:rPr>
         <w:t xml:space="preserve">ب4,0% ‏،</w:t>
       </w:r>
       <w:r>
@@ -818,6 +980,12 @@
         <w:rPr>
           <w:rtl/>
         </w:rPr>
+        <w:t xml:space="preserve"> </w:t>
+      </w:r>
+      <w:r>
+        <w:rPr>
+          <w:rtl/>
+        </w:rPr>
         <w:t xml:space="preserve">ب2,1% ‏،</w:t>
       </w:r>
       <w:r>
@@ -838,6 +1006,12 @@
         <w:rPr>
           <w:rtl/>
         </w:rPr>
+        <w:t xml:space="preserve"> </w:t>
+      </w:r>
+      <w:r>
+        <w:rPr>
+          <w:rtl/>
+        </w:rPr>
         <w:t xml:space="preserve">ب0,6% ‏ و</w:t>
       </w:r>
       <w:r>
@@ -858,6 +1032,12 @@
         <w:rPr>
           <w:rtl/>
         </w:rPr>
+        <w:t xml:space="preserve"> </w:t>
+      </w:r>
+      <w:r>
+        <w:rPr>
+          <w:rtl/>
+        </w:rPr>
         <w:t xml:space="preserve">ب0,4% ‏ و كذا</w:t>
       </w:r>
       <w:r>
@@ -914,6 +1094,12 @@
         <w:rPr>
           <w:rtl/>
         </w:rPr>
+        <w:t xml:space="preserve"> </w:t>
+      </w:r>
+      <w:r>
+        <w:rPr>
+          <w:rtl/>
+        </w:rPr>
         <w:t xml:space="preserve">ب6,9% ‏،</w:t>
       </w:r>
       <w:r>
@@ -934,6 +1120,12 @@
         <w:rPr>
           <w:rtl/>
         </w:rPr>
+        <w:t xml:space="preserve"> </w:t>
+      </w:r>
+      <w:r>
+        <w:rPr>
+          <w:rtl/>
+        </w:rPr>
         <w:t xml:space="preserve">ب4,0% ‏،</w:t>
       </w:r>
       <w:r>
@@ -954,6 +1146,12 @@
         <w:rPr>
           <w:rtl/>
         </w:rPr>
+        <w:t xml:space="preserve"> </w:t>
+      </w:r>
+      <w:r>
+        <w:rPr>
+          <w:rtl/>
+        </w:rPr>
         <w:t xml:space="preserve">ب2,1% ‏،</w:t>
       </w:r>
       <w:r>
@@ -974,6 +1172,12 @@
         <w:rPr>
           <w:rtl/>
         </w:rPr>
+        <w:t xml:space="preserve"> </w:t>
+      </w:r>
+      <w:r>
+        <w:rPr>
+          <w:rtl/>
+        </w:rPr>
         <w:t xml:space="preserve">ب0,6% ‏ و</w:t>
       </w:r>
       <w:r>
@@ -994,6 +1198,12 @@
         <w:rPr>
           <w:rtl/>
         </w:rPr>
+        <w:t xml:space="preserve"> </w:t>
+      </w:r>
+      <w:r>
+        <w:rPr>
+          <w:rtl/>
+        </w:rPr>
         <w:t xml:space="preserve">ب0,4% ‏. وعلى الرغم من الانخفاضات المسجلة في أثمان المواد</w:t>
       </w:r>
       <w:r>
@@ -1026,6 +1236,12 @@
         <w:rPr>
           <w:rtl/>
         </w:rPr>
+        <w:t xml:space="preserve"> </w:t>
+      </w:r>
+      <w:r>
+        <w:rPr>
+          <w:rtl/>
+        </w:rPr>
         <w:t xml:space="preserve">ب18,3% ‏،</w:t>
       </w:r>
       <w:r>
@@ -1046,6 +1262,12 @@
         <w:rPr>
           <w:rtl/>
         </w:rPr>
+        <w:t xml:space="preserve"> </w:t>
+      </w:r>
+      <w:r>
+        <w:rPr>
+          <w:rtl/>
+        </w:rPr>
         <w:t xml:space="preserve">ب8,5% ‏،</w:t>
       </w:r>
       <w:r>
@@ -1066,6 +1288,12 @@
         <w:rPr>
           <w:rtl/>
         </w:rPr>
+        <w:t xml:space="preserve"> </w:t>
+      </w:r>
+      <w:r>
+        <w:rPr>
+          <w:rtl/>
+        </w:rPr>
         <w:t xml:space="preserve">ب5,3% ‏،</w:t>
       </w:r>
       <w:r>
@@ -1086,6 +1314,12 @@
         <w:rPr>
           <w:rtl/>
         </w:rPr>
+        <w:t xml:space="preserve"> </w:t>
+      </w:r>
+      <w:r>
+        <w:rPr>
+          <w:rtl/>
+        </w:rPr>
         <w:t xml:space="preserve">ب4,8% ‏،</w:t>
       </w:r>
       <w:r>
@@ -1106,6 +1340,12 @@
         <w:rPr>
           <w:rtl/>
         </w:rPr>
+        <w:t xml:space="preserve"> </w:t>
+      </w:r>
+      <w:r>
+        <w:rPr>
+          <w:rtl/>
+        </w:rPr>
         <w:t xml:space="preserve">ب2,9% ‏،</w:t>
       </w:r>
       <w:r>
@@ -1126,6 +1366,12 @@
         <w:rPr>
           <w:rtl/>
         </w:rPr>
+        <w:t xml:space="preserve"> </w:t>
+      </w:r>
+      <w:r>
+        <w:rPr>
+          <w:rtl/>
+        </w:rPr>
         <w:t xml:space="preserve">ب0,3% ‏ و</w:t>
       </w:r>
       <w:r>
@@ -1146,6 +1392,12 @@
         <w:rPr>
           <w:rtl/>
         </w:rPr>
+        <w:t xml:space="preserve"> </w:t>
+      </w:r>
+      <w:r>
+        <w:rPr>
+          <w:rtl/>
+        </w:rPr>
         <w:t xml:space="preserve">ب0,1% ‏ و كذا</w:t>
       </w:r>
       <w:r>
@@ -1202,6 +1454,12 @@
         <w:rPr>
           <w:rtl/>
         </w:rPr>
+        <w:t xml:space="preserve"> </w:t>
+      </w:r>
+      <w:r>
+        <w:rPr>
+          <w:rtl/>
+        </w:rPr>
         <w:t xml:space="preserve">ب6,9% ‏،</w:t>
       </w:r>
       <w:r>
@@ -1222,6 +1480,12 @@
         <w:rPr>
           <w:rtl/>
         </w:rPr>
+        <w:t xml:space="preserve"> </w:t>
+      </w:r>
+      <w:r>
+        <w:rPr>
+          <w:rtl/>
+        </w:rPr>
         <w:t xml:space="preserve">ب4,0% ‏،</w:t>
       </w:r>
       <w:r>
@@ -1242,6 +1506,12 @@
         <w:rPr>
           <w:rtl/>
         </w:rPr>
+        <w:t xml:space="preserve"> </w:t>
+      </w:r>
+      <w:r>
+        <w:rPr>
+          <w:rtl/>
+        </w:rPr>
         <w:t xml:space="preserve">ب2,1% ‏،</w:t>
       </w:r>
       <w:r>
@@ -1262,6 +1532,12 @@
         <w:rPr>
           <w:rtl/>
         </w:rPr>
+        <w:t xml:space="preserve"> </w:t>
+      </w:r>
+      <w:r>
+        <w:rPr>
+          <w:rtl/>
+        </w:rPr>
         <w:t xml:space="preserve">ب0,6% ‏ و</w:t>
       </w:r>
       <w:r>
@@ -1282,6 +1558,12 @@
         <w:rPr>
           <w:rtl/>
         </w:rPr>
+        <w:t xml:space="preserve"> </w:t>
+      </w:r>
+      <w:r>
+        <w:rPr>
+          <w:rtl/>
+        </w:rPr>
         <w:t xml:space="preserve">ب0,4% ‏. وعلى الرغم من الانخفاضات المسجلة في أثمان المواد</w:t>
       </w:r>
       <w:r>
@@ -1314,6 +1596,12 @@
         <w:rPr>
           <w:rtl/>
         </w:rPr>
+        <w:t xml:space="preserve"> </w:t>
+      </w:r>
+      <w:r>
+        <w:rPr>
+          <w:rtl/>
+        </w:rPr>
         <w:t xml:space="preserve">ب18,3% ‏،</w:t>
       </w:r>
       <w:r>
@@ -1334,6 +1622,12 @@
         <w:rPr>
           <w:rtl/>
         </w:rPr>
+        <w:t xml:space="preserve"> </w:t>
+      </w:r>
+      <w:r>
+        <w:rPr>
+          <w:rtl/>
+        </w:rPr>
         <w:t xml:space="preserve">ب8,5% ‏،</w:t>
       </w:r>
       <w:r>
@@ -1354,6 +1648,12 @@
         <w:rPr>
           <w:rtl/>
         </w:rPr>
+        <w:t xml:space="preserve"> </w:t>
+      </w:r>
+      <w:r>
+        <w:rPr>
+          <w:rtl/>
+        </w:rPr>
         <w:t xml:space="preserve">ب5,3% ‏،</w:t>
       </w:r>
       <w:r>
@@ -1374,6 +1674,12 @@
         <w:rPr>
           <w:rtl/>
         </w:rPr>
+        <w:t xml:space="preserve"> </w:t>
+      </w:r>
+      <w:r>
+        <w:rPr>
+          <w:rtl/>
+        </w:rPr>
         <w:t xml:space="preserve">ب4,8% ‏،</w:t>
       </w:r>
       <w:r>
@@ -1394,6 +1700,12 @@
         <w:rPr>
           <w:rtl/>
         </w:rPr>
+        <w:t xml:space="preserve"> </w:t>
+      </w:r>
+      <w:r>
+        <w:rPr>
+          <w:rtl/>
+        </w:rPr>
         <w:t xml:space="preserve">ب2,9% ‏،</w:t>
       </w:r>
       <w:r>
@@ -1414,6 +1726,12 @@
         <w:rPr>
           <w:rtl/>
         </w:rPr>
+        <w:t xml:space="preserve"> </w:t>
+      </w:r>
+      <w:r>
+        <w:rPr>
+          <w:rtl/>
+        </w:rPr>
         <w:t xml:space="preserve">ب0,3% ‏ و</w:t>
       </w:r>
       <w:r>
@@ -1434,6 +1752,12 @@
         <w:rPr>
           <w:rtl/>
         </w:rPr>
+        <w:t xml:space="preserve"> </w:t>
+      </w:r>
+      <w:r>
+        <w:rPr>
+          <w:rtl/>
+        </w:rPr>
         <w:t xml:space="preserve">ب0,1% ‏ و كذا</w:t>
       </w:r>
       <w:r>
@@ -1490,6 +1814,12 @@
         <w:rPr>
           <w:rtl/>
         </w:rPr>
+        <w:t xml:space="preserve"> </w:t>
+      </w:r>
+      <w:r>
+        <w:rPr>
+          <w:rtl/>
+        </w:rPr>
         <w:t xml:space="preserve">ب6,9% ‏،</w:t>
       </w:r>
       <w:r>
@@ -1510,6 +1840,12 @@
         <w:rPr>
           <w:rtl/>
         </w:rPr>
+        <w:t xml:space="preserve"> </w:t>
+      </w:r>
+      <w:r>
+        <w:rPr>
+          <w:rtl/>
+        </w:rPr>
         <w:t xml:space="preserve">ب4,0% ‏،</w:t>
       </w:r>
       <w:r>
@@ -1530,6 +1866,12 @@
         <w:rPr>
           <w:rtl/>
         </w:rPr>
+        <w:t xml:space="preserve"> </w:t>
+      </w:r>
+      <w:r>
+        <w:rPr>
+          <w:rtl/>
+        </w:rPr>
         <w:t xml:space="preserve">ب2,1% ‏،</w:t>
       </w:r>
       <w:r>
@@ -1550,6 +1892,12 @@
         <w:rPr>
           <w:rtl/>
         </w:rPr>
+        <w:t xml:space="preserve"> </w:t>
+      </w:r>
+      <w:r>
+        <w:rPr>
+          <w:rtl/>
+        </w:rPr>
         <w:t xml:space="preserve">ب0,6% ‏ و</w:t>
       </w:r>
       <w:r>
@@ -1570,6 +1918,12 @@
         <w:rPr>
           <w:rtl/>
         </w:rPr>
+        <w:t xml:space="preserve"> </w:t>
+      </w:r>
+      <w:r>
+        <w:rPr>
+          <w:rtl/>
+        </w:rPr>
         <w:t xml:space="preserve">ب0,4% ‏. وعلى الرغم من الانخفاضات المسجلة في أثمان المواد</w:t>
       </w:r>
       <w:r>
@@ -1602,6 +1956,12 @@
         <w:rPr>
           <w:rtl/>
         </w:rPr>
+        <w:t xml:space="preserve"> </w:t>
+      </w:r>
+      <w:r>
+        <w:rPr>
+          <w:rtl/>
+        </w:rPr>
         <w:t xml:space="preserve">ب18,3% ‏،</w:t>
       </w:r>
       <w:r>
@@ -1622,6 +1982,12 @@
         <w:rPr>
           <w:rtl/>
         </w:rPr>
+        <w:t xml:space="preserve"> </w:t>
+      </w:r>
+      <w:r>
+        <w:rPr>
+          <w:rtl/>
+        </w:rPr>
         <w:t xml:space="preserve">ب8,5% ‏،</w:t>
       </w:r>
       <w:r>
@@ -1642,6 +2008,12 @@
         <w:rPr>
           <w:rtl/>
         </w:rPr>
+        <w:t xml:space="preserve"> </w:t>
+      </w:r>
+      <w:r>
+        <w:rPr>
+          <w:rtl/>
+        </w:rPr>
         <w:t xml:space="preserve">ب5,3% ‏،</w:t>
       </w:r>
       <w:r>
@@ -1662,6 +2034,12 @@
         <w:rPr>
           <w:rtl/>
         </w:rPr>
+        <w:t xml:space="preserve"> </w:t>
+      </w:r>
+      <w:r>
+        <w:rPr>
+          <w:rtl/>
+        </w:rPr>
         <w:t xml:space="preserve">ب4,8% ‏،</w:t>
       </w:r>
       <w:r>
@@ -1682,6 +2060,12 @@
         <w:rPr>
           <w:rtl/>
         </w:rPr>
+        <w:t xml:space="preserve"> </w:t>
+      </w:r>
+      <w:r>
+        <w:rPr>
+          <w:rtl/>
+        </w:rPr>
         <w:t xml:space="preserve">ب2,9% ‏،</w:t>
       </w:r>
       <w:r>
@@ -1702,6 +2086,12 @@
         <w:rPr>
           <w:rtl/>
         </w:rPr>
+        <w:t xml:space="preserve"> </w:t>
+      </w:r>
+      <w:r>
+        <w:rPr>
+          <w:rtl/>
+        </w:rPr>
         <w:t xml:space="preserve">ب0,3% ‏ و</w:t>
       </w:r>
       <w:r>
@@ -1717,6 +2107,12 @@
           <w:rtl/>
         </w:rPr>
         <w:t xml:space="preserve">مواد غذائية غير مصنفة في مكان آخر</w:t>
+      </w:r>
+      <w:r>
+        <w:rPr>
+          <w:rtl/>
+        </w:rPr>
+        <w:t xml:space="preserve"> </w:t>
       </w:r>
       <w:r>
         <w:rPr>
@@ -1751,7 +2147,7 @@
     </w:p>
     <w:p>
       <w:pPr>
-        <w:pStyle w:val="ipc_corps"/>
+        <w:pStyle w:val="ipccorps"/>
         <w:bidi/>
       </w:pPr>
       <w:r>
@@ -1803,7 +2199,7 @@
     </w:p>
     <w:p>
       <w:pPr>
-        <w:pStyle w:val="ipc_titre_0"/>
+        <w:pStyle w:val="ipctitre0"/>
         <w:bidi/>
       </w:pPr>
       <w:r>
@@ -1862,7 +2258,7 @@
     </w:p>
     <w:p>
       <w:pPr>
-        <w:pStyle w:val="ipc_legende"/>
+        <w:pStyle w:val="ipclegende"/>
         <w:bidi/>
       </w:pPr>
       <w:r>
@@ -1899,7 +2295,7 @@
     </w:p>
     <w:p>
       <w:pPr>
-        <w:pStyle w:val="ipc_titre_0"/>
+        <w:pStyle w:val="ipctitre0"/>
         <w:bidi/>
       </w:pPr>
       <w:r>
@@ -1958,7 +2354,7 @@
     </w:p>
     <w:p>
       <w:pPr>
-        <w:pStyle w:val="ipc_legende"/>
+        <w:pStyle w:val="ipclegende"/>
         <w:bidi/>
       </w:pPr>
       <w:r>
@@ -2000,19 +2396,20 @@
           <w:pgSz w:w="11906" w:h="16838"/>
           <w:pgMar w:top="284" w:bottom="284" w:left="283" w:right="283" w:header="708" w:footer="708" w:gutter="0"/>
           <w:cols w:num="2" w:space="200"/>
+          <w:bidi/>
         </w:sectPr>
       </w:pPr>
     </w:p>
     <w:p>
       <w:pPr>
-        <w:pStyle w:val="ipc_para_0"/>
+        <w:pStyle w:val="ipcpara0"/>
         <w:bidi/>
       </w:pPr>
       <w:r>
         <w:rPr>
           <w:rtl/>
         </w:rPr>
-        <w:t xml:space="preserve">جدول 3: الرقم الاستدلالي للأثمان عند الاستهلاك لمدينة تطوان غشت :2026 (أساس 2017:100)</w:t>
+        <w:t xml:space="preserve">جدول 3: الرقم الاستدلالي للأثمان عند الاستهلاك مدينة تطوان غشت :2026 (أساس 2017:100)</w:t>
       </w:r>
     </w:p>
     <w:tbl xmlns:w="http://schemas.openxmlformats.org/wordprocessingml/2006/main" xmlns:r="http://schemas.openxmlformats.org/officeDocument/2006/relationships" xmlns:w14="http://schemas.microsoft.com/office/word/2010/wordml" xmlns:wp="http://schemas.openxmlformats.org/drawingml/2006/wordprocessingDrawing" xmlns:a="http://schemas.openxmlformats.org/drawingml/2006/main" xmlns:pic="http://schemas.openxmlformats.org/drawingml/2006/picture">
@@ -10976,7 +11373,7 @@
     </w:tbl>
     <w:p>
       <w:pPr>
-        <w:pStyle w:val="ipc_legende_tableau"/>
+        <w:pStyle w:val="ipclegendetableau"/>
         <w:bidi/>
       </w:pPr>
       <w:r>
@@ -10997,17 +11394,6 @@
           <w:rtl/>
         </w:rPr>
         <w:t xml:space="preserve">المندوبية السامية للتخطيط، مديرية الإحصاء -البحث الوطني حول الأثمان عند الاستهلاك</w:t>
-      </w:r>
-    </w:p>
-    <w:p>
-      <w:pPr>
-        <w:bidi/>
-      </w:pPr>
-      <w:r>
-        <w:rPr>
-          <w:rtl/>
-        </w:rPr>
-        <w:t xml:space="preserve">:::</w:t>
       </w:r>
     </w:p>
     <w:p>
@@ -11021,11 +11407,14 @@
       </w:pPr>
     </w:p>
     <w:sectPr>
+      <w:type w:val="nextPage"/>
       <w:pgSz w:h="16838" w:w="11906"/>
-      <w:pgMar w:bottom="284" w:footer="708" w:gutter="0" w:header="708" w:left="283" w:right="283" w:top="284"/>
-      <w:cols w:space="708"/>
+      <w:pgMar w:bottom="284" w:footer="0" w:gutter="0" w:header="0" w:left="283" w:right="283" w:top="284"/>
+      <w:pgNumType w:fmt="decimal"/>
+      <w:formProt w:val="false"/>
+      <w:textDirection w:val="lrTb"/>
       <w:bidi/>
-      <w:docGrid w:linePitch="360"/>
+      <w:docGrid w:charSpace="0" w:linePitch="360" w:type="default"/>
     </w:sectPr>
   </w:body>
 </w:document>
@@ -11139,75 +11528,374 @@
 </file>
 
 <file path=word/styles.xml><?xml version="1.0" encoding="utf-8"?>
-<w:styles xmlns:r="http://schemas.openxmlformats.org/officeDocument/2006/relationships" xmlns:w="http://schemas.openxmlformats.org/wordprocessingml/2006/main">
+<w:styles xmlns:mc="http://schemas.openxmlformats.org/markup-compatibility/2006" xmlns:w="http://schemas.openxmlformats.org/wordprocessingml/2006/main" xmlns:w14="http://schemas.microsoft.com/office/word/2010/wordml" mc:Ignorable="w14">
   <w:docDefaults>
     <w:rPrDefault>
       <w:rPr>
         <w:rFonts w:ascii="Arial" w:cs="Arial" w:eastAsia="Arial" w:hAnsi="Arial"/>
-        <w:sz w:val="20"/>
-        <w:szCs w:val="20"/>
         <w:lang w:bidi="ar" w:eastAsia="fr-FR" w:val="fr-FR"/>
       </w:rPr>
     </w:rPrDefault>
     <w:pPrDefault>
       <w:pPr>
-        <w:bidi/>
-        <w:spacing w:after="120"/>
+        <w:suppressAutoHyphens w:val="true"/>
       </w:pPr>
     </w:pPrDefault>
   </w:docDefaults>
-  <w:latentStyles w:count="276" w:defLockedState="0" w:defQFormat="0" w:defSemiHidden="0" w:defUIPriority="0" w:defUnhideWhenUsed="0"/>
+  <w:latentStyles w:count="267" w:defLockedState="0" w:defQFormat="0" w:defSemiHidden="0" w:defUIPriority="0" w:defUnhideWhenUsed="0"/>
   <w:style w:default="1" w:styleId="Normal" w:type="paragraph">
     <w:name w:val="Normal"/>
     <w:qFormat/>
+    <w:rsid w:val="001435a5"/>
     <w:pPr>
-      <w:bidi/>
+      <w:widowControl/>
+      <w:bidi w:val="1"/>
+      <w:spacing w:after="120" w:before="0"/>
+      <w:jc w:val="left"/>
     </w:pPr>
     <w:rPr>
       <w:rFonts w:ascii="Arial" w:cs="Arial" w:eastAsia="Arial" w:hAnsi="Arial"/>
+      <w:color w:val="auto"/>
+      <w:kern w:val="0"/>
       <w:sz w:val="20"/>
       <w:szCs w:val="20"/>
+      <w:lang w:bidi="ar" w:eastAsia="fr-FR" w:val="fr-FR"/>
+    </w:rPr>
+  </w:style>
+  <w:style w:customStyle="1" w:styleId="Heading1" w:type="paragraph">
+    <w:name w:val="heading 1"/>
+    <w:basedOn w:val="Normal"/>
+    <w:next w:val="BodyText"/>
+    <w:uiPriority w:val="9"/>
+    <w:qFormat/>
+    <w:rsid w:val="001435a5"/>
+    <w:pPr>
+      <w:keepNext w:val="true"/>
+      <w:keepLines/>
+      <w:spacing w:after="0" w:before="480"/>
+      <w:outlineLvl w:val="0"/>
+    </w:pPr>
+    <w:rPr>
+      <w:b/>
+      <w:bCs/>
+      <w:color w:themeColor="accent1" w:val="4F81BD"/>
+      <w:sz w:val="32"/>
+      <w:szCs w:val="32"/>
+    </w:rPr>
+  </w:style>
+  <w:style w:customStyle="1" w:styleId="Heading2" w:type="paragraph">
+    <w:name w:val="heading 2"/>
+    <w:basedOn w:val="Normal"/>
+    <w:next w:val="BodyText"/>
+    <w:uiPriority w:val="9"/>
+    <w:unhideWhenUsed/>
+    <w:qFormat/>
+    <w:rsid w:val="001435a5"/>
+    <w:pPr>
+      <w:keepNext w:val="true"/>
+      <w:keepLines/>
+      <w:spacing w:after="0" w:before="200"/>
+      <w:outlineLvl w:val="1"/>
+    </w:pPr>
+    <w:rPr>
+      <w:b/>
+      <w:bCs/>
+      <w:color w:themeColor="accent1" w:val="4F81BD"/>
+      <w:sz w:val="28"/>
+      <w:szCs w:val="28"/>
+    </w:rPr>
+  </w:style>
+  <w:style w:customStyle="1" w:styleId="Heading3" w:type="paragraph">
+    <w:name w:val="heading 3"/>
+    <w:basedOn w:val="Normal"/>
+    <w:next w:val="BodyText"/>
+    <w:uiPriority w:val="9"/>
+    <w:unhideWhenUsed/>
+    <w:qFormat/>
+    <w:rsid w:val="001435a5"/>
+    <w:pPr>
+      <w:keepNext w:val="true"/>
+      <w:keepLines/>
+      <w:spacing w:after="0" w:before="200"/>
+      <w:outlineLvl w:val="2"/>
+    </w:pPr>
+    <w:rPr>
+      <w:b/>
+      <w:bCs/>
+      <w:color w:themeColor="accent1" w:val="4F81BD"/>
+      <w:sz w:val="24"/>
+      <w:szCs w:val="24"/>
+    </w:rPr>
+  </w:style>
+  <w:style w:customStyle="1" w:styleId="Heading4" w:type="paragraph">
+    <w:name w:val="heading 4"/>
+    <w:basedOn w:val="Normal"/>
+    <w:next w:val="BodyText"/>
+    <w:uiPriority w:val="9"/>
+    <w:unhideWhenUsed/>
+    <w:qFormat/>
+    <w:rsid w:val="001435a5"/>
+    <w:pPr>
+      <w:keepNext w:val="true"/>
+      <w:keepLines/>
+      <w:spacing w:after="0" w:before="200"/>
+      <w:outlineLvl w:val="3"/>
+    </w:pPr>
+    <w:rPr>
+      <w:bCs/>
+      <w:i/>
+      <w:color w:themeColor="accent1" w:val="4F81BD"/>
+      <w:sz w:val="24"/>
+      <w:szCs w:val="24"/>
+    </w:rPr>
+  </w:style>
+  <w:style w:customStyle="1" w:styleId="Heading5" w:type="paragraph">
+    <w:name w:val="heading 5"/>
+    <w:basedOn w:val="Normal"/>
+    <w:next w:val="BodyText"/>
+    <w:uiPriority w:val="9"/>
+    <w:unhideWhenUsed/>
+    <w:qFormat/>
+    <w:rsid w:val="001435a5"/>
+    <w:pPr>
+      <w:keepNext w:val="true"/>
+      <w:keepLines/>
+      <w:spacing w:after="0" w:before="200"/>
+      <w:outlineLvl w:val="4"/>
+    </w:pPr>
+    <w:rPr>
+      <w:iCs/>
+      <w:color w:themeColor="accent1" w:val="4F81BD"/>
+      <w:sz w:val="24"/>
+      <w:szCs w:val="24"/>
+    </w:rPr>
+  </w:style>
+  <w:style w:customStyle="1" w:styleId="Heading6" w:type="paragraph">
+    <w:name w:val="heading 6"/>
+    <w:basedOn w:val="Normal"/>
+    <w:next w:val="BodyText"/>
+    <w:uiPriority w:val="9"/>
+    <w:unhideWhenUsed/>
+    <w:qFormat/>
+    <w:rsid w:val="001435a5"/>
+    <w:pPr>
+      <w:keepNext w:val="true"/>
+      <w:keepLines/>
+      <w:spacing w:after="0" w:before="200"/>
+      <w:outlineLvl w:val="5"/>
+    </w:pPr>
+    <w:rPr>
+      <w:color w:themeColor="accent1" w:val="4F81BD"/>
+      <w:sz w:val="24"/>
+      <w:szCs w:val="24"/>
+    </w:rPr>
+  </w:style>
+  <w:style w:customStyle="1" w:styleId="Heading7" w:type="paragraph">
+    <w:name w:val="heading 7"/>
+    <w:basedOn w:val="Normal"/>
+    <w:next w:val="BodyText"/>
+    <w:uiPriority w:val="9"/>
+    <w:unhideWhenUsed/>
+    <w:qFormat/>
+    <w:rsid w:val="001435a5"/>
+    <w:pPr>
+      <w:keepNext w:val="true"/>
+      <w:keepLines/>
+      <w:spacing w:after="0" w:before="200"/>
+      <w:outlineLvl w:val="6"/>
+    </w:pPr>
+    <w:rPr>
+      <w:color w:themeColor="accent1" w:val="4F81BD"/>
+      <w:sz w:val="24"/>
+      <w:szCs w:val="24"/>
+    </w:rPr>
+  </w:style>
+  <w:style w:customStyle="1" w:styleId="Heading8" w:type="paragraph">
+    <w:name w:val="heading 8"/>
+    <w:basedOn w:val="Normal"/>
+    <w:next w:val="BodyText"/>
+    <w:uiPriority w:val="9"/>
+    <w:unhideWhenUsed/>
+    <w:qFormat/>
+    <w:rsid w:val="001435a5"/>
+    <w:pPr>
+      <w:keepNext w:val="true"/>
+      <w:keepLines/>
+      <w:spacing w:after="0" w:before="200"/>
+      <w:outlineLvl w:val="7"/>
+    </w:pPr>
+    <w:rPr>
+      <w:color w:themeColor="accent1" w:val="4F81BD"/>
+      <w:sz w:val="24"/>
+      <w:szCs w:val="24"/>
+    </w:rPr>
+  </w:style>
+  <w:style w:customStyle="1" w:styleId="Heading9" w:type="paragraph">
+    <w:name w:val="heading 9"/>
+    <w:basedOn w:val="Normal"/>
+    <w:next w:val="BodyText"/>
+    <w:uiPriority w:val="9"/>
+    <w:unhideWhenUsed/>
+    <w:qFormat/>
+    <w:rsid w:val="001435a5"/>
+    <w:pPr>
+      <w:keepNext w:val="true"/>
+      <w:keepLines/>
+      <w:spacing w:after="0" w:before="200"/>
+      <w:outlineLvl w:val="8"/>
+    </w:pPr>
+    <w:rPr>
+      <w:color w:themeColor="accent1" w:val="4F81BD"/>
+      <w:sz w:val="24"/>
+      <w:szCs w:val="24"/>
+    </w:rPr>
+  </w:style>
+  <w:style w:default="1" w:styleId="DefaultParagraphFont" w:type="character">
+    <w:name w:val="Default Paragraph Font"/>
+    <w:uiPriority w:val="1"/>
+    <w:semiHidden/>
+    <w:unhideWhenUsed/>
+    <w:qFormat/>
+    <w:rPr/>
+  </w:style>
+  <w:style w:customStyle="1" w:styleId="CorpsdetexteCar" w:type="character">
+    <w:name w:val="Corps de texte Car"/>
+    <w:basedOn w:val="DefaultParagraphFont"/>
+    <w:qFormat/>
+    <w:rsid w:val="001435a5"/>
+    <w:rPr/>
+  </w:style>
+  <w:style w:customStyle="1" w:styleId="VerbatimChar" w:type="character">
+    <w:name w:val="Verbatim Char"/>
+    <w:basedOn w:val="CorpsdetexteCar"/>
+    <w:qFormat/>
+    <w:rsid w:val="001435a5"/>
+    <w:rPr>
+      <w:rFonts w:ascii="Arial" w:cs="Arial" w:eastAsia="Arial" w:hAnsi="Arial"/>
+      <w:sz w:val="22"/>
+    </w:rPr>
+  </w:style>
+  <w:style w:customStyle="1" w:styleId="SectionNumber" w:type="character">
+    <w:name w:val="Section Number"/>
+    <w:basedOn w:val="CorpsdetexteCar"/>
+    <w:qFormat/>
+    <w:rsid w:val="001435a5"/>
+    <w:rPr/>
+  </w:style>
+  <w:style w:customStyle="1" w:styleId="Caractresdenotedebasdepage" w:type="character">
+    <w:name w:val="Caractères de note de bas de page"/>
+    <w:basedOn w:val="CorpsdetexteCar"/>
+    <w:qFormat/>
+    <w:rsid w:val="001435a5"/>
+    <w:rPr>
+      <w:vertAlign w:val="superscript"/>
+    </w:rPr>
+  </w:style>
+  <w:style w:styleId="FootnoteReference" w:type="character">
+    <w:name w:val="footnote reference"/>
+    <w:rPr>
+      <w:vertAlign w:val="superscript"/>
+    </w:rPr>
+  </w:style>
+  <w:style w:styleId="Hyperlink" w:type="character">
+    <w:name w:val="Hyperlink"/>
+    <w:basedOn w:val="CorpsdetexteCar"/>
+    <w:rsid w:val="001435a5"/>
+    <w:rPr>
+      <w:color w:themeColor="accent1" w:val="4F81BD"/>
+    </w:rPr>
+  </w:style>
+  <w:style w:styleId="Titre" w:type="paragraph">
+    <w:name w:val="Titre"/>
+    <w:basedOn w:val="Normal"/>
+    <w:next w:val="BodyText"/>
+    <w:qFormat/>
+    <w:pPr>
+      <w:keepNext w:val="true"/>
+      <w:spacing w:after="120" w:before="240"/>
+    </w:pPr>
+    <w:rPr>
+      <w:rFonts w:ascii="Liberation Sans" w:cs="Tahoma" w:eastAsia="Microsoft YaHei" w:hAnsi="Liberation Sans"/>
+      <w:sz w:val="28"/>
+      <w:szCs w:val="28"/>
     </w:rPr>
   </w:style>
   <w:style w:styleId="BodyText" w:type="paragraph">
     <w:name w:val="Body Text"/>
     <w:basedOn w:val="Normal"/>
-    <w:link w:val="BodyTextChar"/>
+    <w:link w:val="CorpsdetexteCar"/>
+    <w:qFormat/>
+    <w:rsid w:val="001435a5"/>
     <w:pPr>
       <w:spacing w:after="180" w:before="180"/>
     </w:pPr>
+    <w:rPr/>
+  </w:style>
+  <w:style w:styleId="List" w:type="paragraph">
+    <w:name w:val="List"/>
+    <w:basedOn w:val="BodyText"/>
+    <w:pPr/>
+    <w:rPr>
+      <w:rFonts w:cs="Tahoma"/>
+    </w:rPr>
+  </w:style>
+  <w:style w:customStyle="1" w:styleId="Caption" w:type="paragraph">
+    <w:name w:val="caption"/>
+    <w:basedOn w:val="Normal"/>
+    <w:link w:val="CorpsdetexteCar"/>
     <w:qFormat/>
+    <w:rsid w:val="001435a5"/>
+    <w:pPr/>
+    <w:rPr>
+      <w:i/>
+    </w:rPr>
+  </w:style>
+  <w:style w:styleId="Index" w:type="paragraph">
+    <w:name w:val="Index"/>
+    <w:basedOn w:val="Normal"/>
+    <w:qFormat/>
+    <w:pPr>
+      <w:suppressLineNumbers/>
+    </w:pPr>
+    <w:rPr>
+      <w:rFonts w:cs="Tahoma"/>
+    </w:rPr>
   </w:style>
   <w:style w:customStyle="1" w:styleId="FirstParagraph" w:type="paragraph">
     <w:name w:val="First Paragraph"/>
     <w:basedOn w:val="BodyText"/>
     <w:next w:val="BodyText"/>
     <w:qFormat/>
+    <w:rsid w:val="001435a5"/>
+    <w:pPr/>
+    <w:rPr/>
   </w:style>
   <w:style w:customStyle="1" w:styleId="Compact" w:type="paragraph">
     <w:name w:val="Compact"/>
     <w:basedOn w:val="BodyText"/>
     <w:qFormat/>
+    <w:rsid w:val="001435a5"/>
     <w:pPr>
       <w:spacing w:after="36" w:before="36"/>
     </w:pPr>
+    <w:rPr/>
   </w:style>
   <w:style w:styleId="Title" w:type="paragraph">
     <w:name w:val="Title"/>
     <w:basedOn w:val="Normal"/>
     <w:next w:val="BodyText"/>
     <w:qFormat/>
+    <w:rsid w:val="001435a5"/>
     <w:pPr>
-      <w:keepNext/>
+      <w:keepNext w:val="true"/>
       <w:keepLines/>
       <w:spacing w:after="240" w:before="480"/>
       <w:jc w:val="center"/>
     </w:pPr>
     <w:rPr>
-      <w:rFonts w:ascii="Arial" w:cs="Arial" w:eastAsia="Arial" w:hAnsi="Arial"/>
       <w:b/>
       <w:bCs/>
-      <w:color w:themeColor="accent1" w:themeShade="B5" w:val="345A8A"/>
+      <w:color w:themeColor="accent1" w:themeShade="b5" w:val="345A8A"/>
       <w:sz w:val="36"/>
       <w:szCs w:val="36"/>
     </w:rPr>
@@ -11217,11 +11905,9 @@
     <w:basedOn w:val="Title"/>
     <w:next w:val="BodyText"/>
     <w:qFormat/>
+    <w:rsid w:val="001435a5"/>
     <w:pPr>
-      <w:keepNext/>
-      <w:keepLines/>
       <w:spacing w:after="240" w:before="240"/>
-      <w:jc w:val="center"/>
     </w:pPr>
     <w:rPr>
       <w:sz w:val="30"/>
@@ -11232,39 +11918,61 @@
     <w:name w:val="Author"/>
     <w:next w:val="BodyText"/>
     <w:qFormat/>
+    <w:rsid w:val="001435a5"/>
     <w:pPr>
-      <w:keepNext/>
+      <w:keepNext w:val="true"/>
       <w:keepLines/>
+      <w:widowControl/>
+      <w:bidi w:val="1"/>
+      <w:spacing w:after="120" w:before="0"/>
       <w:jc w:val="center"/>
     </w:pPr>
+    <w:rPr>
+      <w:rFonts w:ascii="Arial" w:cs="Arial" w:eastAsia="Arial" w:hAnsi="Arial"/>
+      <w:color w:val="auto"/>
+      <w:kern w:val="0"/>
+      <w:sz w:val="20"/>
+      <w:szCs w:val="20"/>
+      <w:lang w:bidi="ar" w:eastAsia="fr-FR" w:val="fr-FR"/>
+    </w:rPr>
   </w:style>
   <w:style w:styleId="Date" w:type="paragraph">
     <w:name w:val="Date"/>
     <w:next w:val="BodyText"/>
     <w:qFormat/>
+    <w:rsid w:val="001435a5"/>
     <w:pPr>
-      <w:keepNext/>
+      <w:keepNext w:val="true"/>
       <w:keepLines/>
+      <w:widowControl/>
+      <w:bidi w:val="1"/>
+      <w:spacing w:after="120" w:before="0"/>
       <w:jc w:val="center"/>
     </w:pPr>
+    <w:rPr>
+      <w:rFonts w:ascii="Arial" w:cs="Arial" w:eastAsia="Arial" w:hAnsi="Arial"/>
+      <w:color w:val="auto"/>
+      <w:kern w:val="0"/>
+      <w:sz w:val="20"/>
+      <w:szCs w:val="20"/>
+      <w:lang w:bidi="ar" w:eastAsia="fr-FR" w:val="fr-FR"/>
+    </w:rPr>
   </w:style>
   <w:style w:customStyle="1" w:styleId="AbstractTitle" w:type="paragraph">
     <w:name w:val="Abstract Title"/>
     <w:basedOn w:val="Normal"/>
     <w:next w:val="Abstract"/>
     <w:qFormat/>
+    <w:rsid w:val="001435a5"/>
     <w:pPr>
-      <w:keepNext/>
+      <w:keepNext w:val="true"/>
       <w:keepLines/>
+      <w:spacing w:after="0" w:before="300"/>
       <w:jc w:val="center"/>
-      <w:spacing w:after="0" w:before="300"/>
     </w:pPr>
     <w:rPr>
-      <w:sz w:val="20"/>
-      <w:szCs w:val="20"/>
       <w:b/>
       <w:color w:val="345A8A"/>
-      &gt;
     </w:rPr>
   </w:style>
   <w:style w:customStyle="1" w:styleId="Abstract" w:type="paragraph">
@@ -11272,211 +11980,21 @@
     <w:basedOn w:val="Normal"/>
     <w:next w:val="BodyText"/>
     <w:qFormat/>
+    <w:rsid w:val="001435a5"/>
     <w:pPr>
-      <w:keepNext/>
+      <w:keepNext w:val="true"/>
       <w:keepLines/>
       <w:spacing w:after="300" w:before="100"/>
     </w:pPr>
-    <w:rPr>
-      <w:sz w:val="20"/>
-      <w:szCs w:val="20"/>
-    </w:rPr>
+    <w:rPr/>
   </w:style>
   <w:style w:styleId="Bibliography" w:type="paragraph">
     <w:name w:val="Bibliography"/>
     <w:basedOn w:val="Normal"/>
-    <w:next w:val="Bibliography"/>
     <w:qFormat/>
+    <w:rsid w:val="001435a5"/>
     <w:pPr/>
     <w:rPr/>
-  </w:style>
-  <w:style w:styleId="Heading1" w:type="paragraph">
-    <w:name w:val="Heading 1"/>
-    <w:basedOn w:val="Normal"/>
-    <w:next w:val="BodyText"/>
-    <w:uiPriority w:val="9"/>
-    <w:qFormat/>
-    <w:pPr>
-      <w:keepNext/>
-      <w:keepLines/>
-      <w:spacing w:after="0" w:before="480"/>
-      <w:outlineLvl w:val="0"/>
-    </w:pPr>
-    <w:rPr>
-      <w:rFonts w:ascii="Arial" w:cs="Arial" w:eastAsia="Arial" w:hAnsi="Arial"/>
-      <w:b/>
-      <w:bCs/>
-      <w:color w:themeColor="accent1" w:val="4F81BD"/>
-      <w:sz w:val="32"/>
-      <w:szCs w:val="32"/>
-    </w:rPr>
-  </w:style>
-  <w:style w:styleId="Heading2" w:type="paragraph">
-    <w:name w:val="Heading 2"/>
-    <w:basedOn w:val="Normal"/>
-    <w:next w:val="BodyText"/>
-    <w:uiPriority w:val="9"/>
-    <w:unhideWhenUsed/>
-    <w:qFormat/>
-    <w:pPr>
-      <w:keepNext/>
-      <w:keepLines/>
-      <w:spacing w:after="0" w:before="200"/>
-      <w:outlineLvl w:val="1"/>
-    </w:pPr>
-    <w:rPr>
-      <w:rFonts w:ascii="Arial" w:cs="Arial" w:eastAsia="Arial" w:hAnsi="Arial"/>
-      <w:b/>
-      <w:bCs/>
-      <w:color w:themeColor="accent1" w:val="4F81BD"/>
-      <w:sz w:val="28"/>
-      <w:szCs w:val="28"/>
-    </w:rPr>
-  </w:style>
-  <w:style w:styleId="Heading3" w:type="paragraph">
-    <w:name w:val="Heading 3"/>
-    <w:basedOn w:val="Normal"/>
-    <w:next w:val="BodyText"/>
-    <w:uiPriority w:val="9"/>
-    <w:unhideWhenUsed/>
-    <w:qFormat/>
-    <w:pPr>
-      <w:keepNext/>
-      <w:keepLines/>
-      <w:spacing w:after="0" w:before="200"/>
-      <w:outlineLvl w:val="2"/>
-    </w:pPr>
-    <w:rPr>
-      <w:rFonts w:ascii="Arial" w:cs="Arial" w:eastAsia="Arial" w:hAnsi="Arial"/>
-      <w:b/>
-      <w:bCs/>
-      <w:color w:themeColor="accent1" w:val="4F81BD"/>
-      <w:sz w:val="24"/>
-      <w:szCs w:val="24"/>
-    </w:rPr>
-  </w:style>
-  <w:style w:styleId="Heading4" w:type="paragraph">
-    <w:name w:val="Heading 4"/>
-    <w:basedOn w:val="Normal"/>
-    <w:next w:val="BodyText"/>
-    <w:uiPriority w:val="9"/>
-    <w:unhideWhenUsed/>
-    <w:qFormat/>
-    <w:pPr>
-      <w:keepNext/>
-      <w:keepLines/>
-      <w:spacing w:after="0" w:before="200"/>
-      <w:outlineLvl w:val="3"/>
-    </w:pPr>
-    <w:rPr>
-      <w:rFonts w:ascii="Arial" w:cs="Arial" w:eastAsia="Arial" w:hAnsi="Arial"/>
-      <w:i/>
-      <w:bCs/>
-      <w:color w:themeColor="accent1" w:val="4F81BD"/>
-      <w:sz w:val="24"/>
-      <w:szCs w:val="24"/>
-    </w:rPr>
-  </w:style>
-  <w:style w:styleId="Heading5" w:type="paragraph">
-    <w:name w:val="Heading 5"/>
-    <w:basedOn w:val="Normal"/>
-    <w:next w:val="BodyText"/>
-    <w:uiPriority w:val="9"/>
-    <w:unhideWhenUsed/>
-    <w:qFormat/>
-    <w:pPr>
-      <w:keepNext/>
-      <w:keepLines/>
-      <w:spacing w:after="0" w:before="200"/>
-      <w:outlineLvl w:val="4"/>
-    </w:pPr>
-    <w:rPr>
-      <w:rFonts w:ascii="Arial" w:cs="Arial" w:eastAsia="Arial" w:hAnsi="Arial"/>
-      <w:iCs/>
-      <w:color w:themeColor="accent1" w:val="4F81BD"/>
-      <w:sz w:val="24"/>
-      <w:szCs w:val="24"/>
-    </w:rPr>
-  </w:style>
-  <w:style w:styleId="Heading6" w:type="paragraph">
-    <w:name w:val="Heading 6"/>
-    <w:basedOn w:val="Normal"/>
-    <w:next w:val="BodyText"/>
-    <w:uiPriority w:val="9"/>
-    <w:unhideWhenUsed/>
-    <w:qFormat/>
-    <w:pPr>
-      <w:keepNext/>
-      <w:keepLines/>
-      <w:spacing w:after="0" w:before="200"/>
-      <w:outlineLvl w:val="5"/>
-    </w:pPr>
-    <w:rPr>
-      <w:rFonts w:ascii="Arial" w:cs="Arial" w:eastAsia="Arial" w:hAnsi="Arial"/>
-      <w:color w:themeColor="accent1" w:val="4F81BD"/>
-      <w:sz w:val="24"/>
-      <w:szCs w:val="24"/>
-    </w:rPr>
-  </w:style>
-  <w:style w:styleId="Heading7" w:type="paragraph">
-    <w:name w:val="Heading 7"/>
-    <w:basedOn w:val="Normal"/>
-    <w:next w:val="BodyText"/>
-    <w:uiPriority w:val="9"/>
-    <w:unhideWhenUsed/>
-    <w:qFormat/>
-    <w:pPr>
-      <w:keepNext/>
-      <w:keepLines/>
-      <w:spacing w:after="0" w:before="200"/>
-      <w:outlineLvl w:val="6"/>
-    </w:pPr>
-    <w:rPr>
-      <w:rFonts w:ascii="Arial" w:cs="Arial" w:eastAsia="Arial" w:hAnsi="Arial"/>
-      <w:color w:themeColor="accent1" w:val="4F81BD"/>
-      <w:sz w:val="24"/>
-      <w:szCs w:val="24"/>
-    </w:rPr>
-  </w:style>
-  <w:style w:styleId="Heading8" w:type="paragraph">
-    <w:name w:val="Heading 8"/>
-    <w:basedOn w:val="Normal"/>
-    <w:next w:val="BodyText"/>
-    <w:uiPriority w:val="9"/>
-    <w:unhideWhenUsed/>
-    <w:qFormat/>
-    <w:pPr>
-      <w:keepNext/>
-      <w:keepLines/>
-      <w:spacing w:after="0" w:before="200"/>
-      <w:outlineLvl w:val="7"/>
-    </w:pPr>
-    <w:rPr>
-      <w:rFonts w:ascii="Arial" w:cs="Arial" w:eastAsia="Arial" w:hAnsi="Arial"/>
-      <w:color w:themeColor="accent1" w:val="4F81BD"/>
-      <w:sz w:val="24"/>
-      <w:szCs w:val="24"/>
-    </w:rPr>
-  </w:style>
-  <w:style w:styleId="Heading9" w:type="paragraph">
-    <w:name w:val="Heading 9"/>
-    <w:basedOn w:val="Normal"/>
-    <w:next w:val="BodyText"/>
-    <w:uiPriority w:val="9"/>
-    <w:unhideWhenUsed/>
-    <w:qFormat/>
-    <w:pPr>
-      <w:keepNext/>
-      <w:keepLines/>
-      <w:spacing w:after="0" w:before="200"/>
-      <w:outlineLvl w:val="8"/>
-    </w:pPr>
-    <w:rPr>
-      <w:rFonts w:ascii="Arial" w:cs="Arial" w:eastAsia="Arial" w:hAnsi="Arial"/>
-      <w:color w:themeColor="accent1" w:val="4F81BD"/>
-      <w:sz w:val="24"/>
-      <w:szCs w:val="24"/>
-    </w:rPr>
   </w:style>
   <w:style w:styleId="BlockText" w:type="paragraph">
     <w:name w:val="Block Text"/>
@@ -11485,33 +12003,218 @@
     <w:uiPriority w:val="9"/>
     <w:unhideWhenUsed/>
     <w:qFormat/>
+    <w:rsid w:val="001435a5"/>
     <w:pPr>
       <w:spacing w:after="100" w:before="100"/>
-      <w:ind w:firstLine="0" w:left="480" w:right="480"/>
+      <w:ind w:left="480" w:right="480"/>
     </w:pPr>
+    <w:rPr/>
   </w:style>
-  <w:style w:styleId="FootnoteText" w:type="paragraph">
-    <w:name w:val="Footnote Text"/>
+  <w:style w:customStyle="1" w:styleId="FootnoteText" w:type="paragraph">
+    <w:name w:val="footnote text"/>
     <w:basedOn w:val="Normal"/>
-    <w:next w:val="FootnoteText"/>
     <w:uiPriority w:val="9"/>
     <w:unhideWhenUsed/>
     <w:qFormat/>
+    <w:rsid w:val="001435a5"/>
+    <w:pPr/>
+    <w:rPr/>
   </w:style>
-  <w:style w:default="1" w:styleId="DefaultParagraphFont" w:type="character">
-    <w:name w:val="Default Paragraph Font"/>
+  <w:style w:customStyle="1" w:styleId="DefinitionTerm" w:type="paragraph">
+    <w:name w:val="Definition Term"/>
+    <w:basedOn w:val="Normal"/>
+    <w:next w:val="Definition"/>
+    <w:qFormat/>
+    <w:rsid w:val="001435a5"/>
+    <w:pPr>
+      <w:keepNext w:val="true"/>
+      <w:keepLines/>
+      <w:spacing w:after="0" w:before="0"/>
+    </w:pPr>
+    <w:rPr>
+      <w:b/>
+    </w:rPr>
+  </w:style>
+  <w:style w:customStyle="1" w:styleId="Definition" w:type="paragraph">
+    <w:name w:val="Definition"/>
+    <w:basedOn w:val="Normal"/>
+    <w:qFormat/>
+    <w:rsid w:val="001435a5"/>
+    <w:pPr/>
+    <w:rPr/>
+  </w:style>
+  <w:style w:customStyle="1" w:styleId="TableCaption" w:type="paragraph">
+    <w:name w:val="Table Caption"/>
+    <w:basedOn w:val="Caption"/>
+    <w:qFormat/>
+    <w:rsid w:val="001435a5"/>
+    <w:pPr>
+      <w:keepNext w:val="true"/>
+    </w:pPr>
+    <w:rPr/>
+  </w:style>
+  <w:style w:customStyle="1" w:styleId="ImageCaption" w:type="paragraph">
+    <w:name w:val="Image Caption"/>
+    <w:basedOn w:val="Caption"/>
+    <w:qFormat/>
+    <w:rsid w:val="001435a5"/>
+    <w:pPr/>
+    <w:rPr/>
+  </w:style>
+  <w:style w:customStyle="1" w:styleId="Figure" w:type="paragraph">
+    <w:name w:val="Figure"/>
+    <w:basedOn w:val="Normal"/>
+    <w:qFormat/>
+    <w:rsid w:val="001435a5"/>
+    <w:pPr/>
+    <w:rPr/>
+  </w:style>
+  <w:style w:customStyle="1" w:styleId="CaptionedFigure" w:type="paragraph">
+    <w:name w:val="Captioned Figure"/>
+    <w:basedOn w:val="Figure"/>
+    <w:qFormat/>
+    <w:rsid w:val="001435a5"/>
+    <w:pPr>
+      <w:keepNext w:val="true"/>
+    </w:pPr>
+    <w:rPr/>
+  </w:style>
+  <w:style w:styleId="IndexHeading" w:type="paragraph">
+    <w:name w:val="index heading"/>
+    <w:basedOn w:val="Titre"/>
+    <w:pPr/>
+    <w:rPr/>
+  </w:style>
+  <w:style w:styleId="TOCHeading" w:type="paragraph">
+    <w:name w:val="TOC Heading"/>
+    <w:basedOn w:val="Heading1"/>
+    <w:next w:val="BodyText"/>
+    <w:uiPriority w:val="39"/>
+    <w:unhideWhenUsed/>
+    <w:qFormat/>
+    <w:rsid w:val="001435a5"/>
+    <w:pPr>
+      <w:spacing w:after="0" w:before="240" w:line="259" w:lineRule="auto"/>
+      <w:outlineLvl w:val="9"/>
+    </w:pPr>
+    <w:rPr>
+      <w:b w:val="false"/>
+      <w:bCs w:val="false"/>
+      <w:color w:themeColor="accent1" w:themeShade="bf" w:val="365F91"/>
+    </w:rPr>
+  </w:style>
+  <w:style w:customStyle="1" w:styleId="ipcpara0" w:type="paragraph">
+    <w:name w:val="ipc_para_0"/>
+    <w:basedOn w:val="Normal"/>
+    <w:qFormat/>
+    <w:rsid w:val="006c6bd7"/>
+    <w:pPr>
+      <w:spacing w:after="100" w:before="60" w:line="276" w:lineRule="auto"/>
+      <w:jc w:val="both"/>
+    </w:pPr>
+    <w:rPr>
+      <w:rFonts w:ascii="Times New Roman" w:eastAsia="Times New Roman" w:hAnsi="Times New Roman"/>
+      <w:b/>
+      <w:bCs/>
+      <w:color w:val="8D4354"/>
+      <w:sz w:val="21"/>
+      <w:szCs w:val="21"/>
+    </w:rPr>
+  </w:style>
+  <w:style w:customStyle="1" w:styleId="ipccorps" w:type="paragraph">
+    <w:name w:val="ipc_corps"/>
+    <w:basedOn w:val="Normal"/>
+    <w:qFormat/>
+    <w:rsid w:val="006c6bd7"/>
+    <w:pPr>
+      <w:spacing w:after="100" w:before="0" w:line="276" w:lineRule="auto"/>
+      <w:jc w:val="both"/>
+    </w:pPr>
+    <w:rPr>
+      <w:rFonts w:ascii="Times New Roman" w:eastAsia="Times New Roman" w:hAnsi="Times New Roman"/>
+      <w:sz w:val="19"/>
+      <w:szCs w:val="19"/>
+    </w:rPr>
+  </w:style>
+  <w:style w:customStyle="1" w:styleId="ipctitre0" w:type="paragraph">
+    <w:name w:val="ipc_titre_0"/>
+    <w:basedOn w:val="Normal"/>
+    <w:qFormat/>
+    <w:rsid w:val="006c6bd7"/>
+    <w:pPr>
+      <w:keepNext w:val="true"/>
+      <w:keepLines/>
+      <w:spacing w:after="60" w:before="120"/>
+      <w:jc w:val="center"/>
+    </w:pPr>
+    <w:rPr>
+      <w:rFonts w:ascii="Times New Roman" w:eastAsia="Times New Roman" w:hAnsi="Times New Roman"/>
+      <w:b/>
+      <w:bCs/>
+      <w:color w:val="8D4354"/>
+      <w:sz w:val="19"/>
+      <w:szCs w:val="19"/>
+    </w:rPr>
+  </w:style>
+  <w:style w:customStyle="1" w:styleId="ipclegende" w:type="paragraph">
+    <w:name w:val="ipc_legende"/>
+    <w:basedOn w:val="Normal"/>
+    <w:qFormat/>
+    <w:rsid w:val="006c6bd7"/>
+    <w:pPr>
+      <w:spacing w:after="120" w:before="40"/>
+      <w:jc w:val="center"/>
+    </w:pPr>
+    <w:rPr>
+      <w:rFonts w:ascii="Times New Roman" w:eastAsia="Times New Roman" w:hAnsi="Times New Roman"/>
+      <w:sz w:val="15"/>
+      <w:szCs w:val="15"/>
+    </w:rPr>
+  </w:style>
+  <w:style w:customStyle="1" w:styleId="ipclegendetableau" w:type="paragraph">
+    <w:name w:val="ipc_legende_tableau"/>
+    <w:basedOn w:val="Normal"/>
+    <w:qFormat/>
+    <w:rsid w:val="001435a5"/>
+    <w:pPr>
+      <w:spacing w:after="60" w:before="40"/>
+      <w:jc w:val="center"/>
+    </w:pPr>
+    <w:rPr>
+      <w:rFonts w:eastAsia="Times New Roman"/>
+      <w:sz w:val="15"/>
+      <w:szCs w:val="15"/>
+    </w:rPr>
+  </w:style>
+  <w:style w:default="1" w:styleId="Pasdeliste" w:type="numbering">
+    <w:name w:val="Pas de liste"/>
+    <w:uiPriority w:val="99"/>
     <w:semiHidden/>
     <w:unhideWhenUsed/>
+    <w:qFormat/>
   </w:style>
-  <w:style w:default="1" w:styleId="Table" w:type="table">
-    <w:name w:val="Table"/>
-    <w:basedOn w:val="TableNormal"/>
+  <w:style w:default="1" w:styleId="TableauNormal" w:type="table">
+    <w:name w:val="Normal Table"/>
+    <w:uiPriority w:val="99"/>
     <w:semiHidden/>
     <w:unhideWhenUsed/>
     <w:qFormat/>
     <w:tblPr>
-      <w:bidiVisual/>
-      <w:tblInd w:type="dxa" w:w="0"/>
+      <w:tblCellMar>
+        <w:top w:type="dxa" w:w="0"/>
+        <w:left w:type="dxa" w:w="108"/>
+        <w:bottom w:type="dxa" w:w="0"/>
+        <w:right w:type="dxa" w:w="108"/>
+      </w:tblCellMar>
+    </w:tblPr>
+  </w:style>
+  <w:style w:customStyle="1" w:styleId="Table" w:type="table">
+    <w:name w:val="Table"/>
+    <w:semiHidden/>
+    <w:unhideWhenUsed/>
+    <w:qFormat/>
+    <w:rsid w:val="001435a5"/>
+    <w:tblPr>
       <w:tblCellMar>
         <w:top w:type="dxa" w:w="0"/>
         <w:left w:type="dxa" w:w="108"/>
@@ -11520,202 +12223,14 @@
       </w:tblCellMar>
     </w:tblPr>
     <w:tblStylePr w:type="firstRow">
-      <w:tblPr>
-        <w:jc w:val="left"/>
-        <w:tblInd w:type="dxa" w:w="0"/>
-      </w:tblPr>
-      <w:trPr>
-        <w:jc w:val="left"/>
-      </w:trPr>
+      <w:tblPr/>
       <w:tcPr>
+        <w:tcBorders>
+          <w:bottom w:color="auto" w:space="0" w:sz="0" w:val="single"/>
+        </w:tcBorders>
         <w:vAlign w:val="bottom"/>
-        <w:tcBorders>
-          <w:bottom w:val="single"/>
-        </w:tcBorders>
       </w:tcPr>
     </w:tblStylePr>
-  </w:style>
-  <w:style w:customStyle="1" w:styleId="DefinitionTerm" w:type="paragraph">
-    <w:name w:val="Definition Term"/>
-    <w:basedOn w:val="Normal"/>
-    <w:next w:val="Definition"/>
-    <w:pPr>
-      <w:keepNext/>
-      <w:keepLines/>
-      <w:spacing w:after="0"/>
-    </w:pPr>
-    <w:rPr>
-      <w:b/>
-    </w:rPr>
-  </w:style>
-  <w:style w:customStyle="1" w:styleId="Definition" w:type="paragraph">
-    <w:name w:val="Definition"/>
-    <w:basedOn w:val="Normal"/>
-  </w:style>
-  <w:style w:styleId="Caption" w:type="paragraph">
-    <w:name w:val="Caption"/>
-    <w:basedOn w:val="Normal"/>
-    <w:link w:val="BodyTextChar"/>
-    <w:pPr>
-      <w:spacing w:after="120" w:before="0"/>
-    </w:pPr>
-    <w:rPr>
-      <w:i/>
-    </w:rPr>
-  </w:style>
-  <w:style w:customStyle="1" w:styleId="TableCaption" w:type="paragraph">
-    <w:name w:val="Table Caption"/>
-    <w:basedOn w:val="Caption"/>
-    <w:pPr>
-      <w:keepNext/>
-    </w:pPr>
-  </w:style>
-  <w:style w:customStyle="1" w:styleId="ImageCaption" w:type="paragraph">
-    <w:name w:val="Image Caption"/>
-    <w:basedOn w:val="Caption"/>
-  </w:style>
-  <w:style w:customStyle="1" w:styleId="Figure" w:type="paragraph">
-    <w:name w:val="Figure"/>
-    <w:basedOn w:val="Normal"/>
-  </w:style>
-  <w:style w:customStyle="1" w:styleId="CaptionedFigure" w:type="paragraph">
-    <w:name w:val="Captioned Figure"/>
-    <w:basedOn w:val="Figure"/>
-    <w:pPr>
-      <w:keepNext/>
-    </w:pPr>
-  </w:style>
-  <w:style w:customStyle="1" w:styleId="BodyTextChar" w:type="character">
-    <w:name w:val="Body Text Char"/>
-    <w:basedOn w:val="DefaultParagraphFont"/>
-    <w:link w:val="BodyText"/>
-  </w:style>
-  <w:style w:customStyle="1" w:styleId="VerbatimChar" w:type="character">
-    <w:name w:val="Verbatim Char"/>
-    <w:basedOn w:val="BodyTextChar"/>
-    <w:rPr>
-      <w:rFonts w:ascii="Arial" w:cs="Arial" w:eastAsia="Arial" w:hAnsi="Arial"/>
-      <w:sz w:val="22"/>
-    </w:rPr>
-  </w:style>
-  <w:style w:customStyle="1" w:styleId="SectionNumber" w:type="character">
-    <w:name w:val="Section Number"/>
-    <w:basedOn w:val="BodyTextChar"/>
-  </w:style>
-  <w:style w:styleId="FootnoteReference" w:type="character">
-    <w:name w:val="Footnote Reference"/>
-    <w:basedOn w:val="BodyTextChar"/>
-    <w:rPr>
-      <w:vertAlign w:val="superscript"/>
-    </w:rPr>
-  </w:style>
-  <w:style w:styleId="Hyperlink" w:type="character">
-    <w:name w:val="Hyperlink"/>
-    <w:basedOn w:val="BodyTextChar"/>
-    <w:rPr>
-      <w:color w:themeColor="accent1" w:val="4F81BD"/>
-    </w:rPr>
-  </w:style>
-  <w:style w:styleId="TOCHeading" w:type="paragraph">
-    <w:name w:val="TOC Heading"/>
-    <w:basedOn w:val="Heading1"/>
-    <w:next w:val="BodyText"/>
-    <w:uiPriority w:val="39"/>
-    <w:unhideWhenUsed/>
-    <w:qFormat/>
-    <w:pPr>
-      <w:spacing w:before="240" w:line="259" w:lineRule="auto"/>
-      <w:outlineLvl w:val="9"/>
-    </w:pPr>
-    <w:rPr>
-      <w:rFonts w:ascii="Arial" w:cs="Arial" w:eastAsia="Arial" w:hAnsi="Arial"/>
-      <w:b w:val="0"/>
-      <w:bCs w:val="0"/>
-      <w:color w:themeColor="accent1" w:themeShade="BF" w:val="365F91"/>
-    </w:rPr>
-  </w:style>
-  <w:style w:customStyle="1" w:styleId="ipc_para_0" w:type="paragraph">
-    <w:name w:val="ipc_para_0"/>
-    <w:basedOn w:val="Normal"/>
-    <w:qFormat/>
-    <w:pPr>
-      <w:bidi/>
-      <w:spacing w:after="100" w:before="60" w:line="276" w:lineRule="auto"/>
-      <w:jc w:val="both"/>
-    </w:pPr>
-    <w:rPr>
-      <w:rFonts w:ascii="Arial" w:cs="Arial" w:eastAsia="Arial" w:hAnsi="Arial"/>
-      <w:b/>
-      <w:bCs/>
-      <w:color w:val="8D4354"/>
-      <w:sz w:val="21"/>
-      <w:szCs w:val="21"/>
-    </w:rPr>
-  </w:style>
-  <w:style w:customStyle="1" w:styleId="ipc_corps" w:type="paragraph">
-    <w:name w:val="ipc_corps"/>
-    <w:basedOn w:val="Normal"/>
-    <w:qFormat/>
-    <w:pPr>
-      <w:bidi/>
-      <w:spacing w:after="100" w:before="0" w:line="276" w:lineRule="auto"/>
-      <w:jc w:val="both"/>
-    </w:pPr>
-    <w:rPr>
-      <w:rFonts w:ascii="Arial" w:cs="Arial" w:eastAsia="Arial" w:hAnsi="Arial"/>
-      <w:sz w:val="19"/>
-      <w:szCs w:val="19"/>
-    </w:rPr>
-  </w:style>
-  <w:style w:customStyle="1" w:styleId="ipc_titre_0" w:type="paragraph">
-    <w:name w:val="ipc_titre_0"/>
-    <w:basedOn w:val="Normal"/>
-    <w:qFormat/>
-    <w:pPr>
-      <w:keepNext/>
-      <w:keepLines/>
-      <w:bidi/>
-      <w:spacing w:after="60" w:before="120"/>
-      <w:jc w:val="center"/>
-    </w:pPr>
-    <w:rPr>
-      <w:rFonts w:ascii="Arial" w:cs="Arial" w:eastAsia="Arial" w:hAnsi="Arial"/>
-      <w:b/>
-      <w:bCs/>
-      <w:color w:val="8D4354"/>
-      <w:sz w:val="19"/>
-      <w:szCs w:val="19"/>
-    </w:rPr>
-  </w:style>
-  <w:style w:customStyle="1" w:styleId="ipc_legende" w:type="paragraph">
-    <w:name w:val="ipc_legende"/>
-    <w:basedOn w:val="Normal"/>
-    <w:qFormat/>
-    <w:pPr>
-      <w:bidi/>
-      <w:spacing w:after="120" w:before="40"/>
-      <w:jc w:val="center"/>
-    </w:pPr>
-    <w:rPr>
-      <w:rFonts w:ascii="Arial" w:cs="Arial" w:eastAsia="Arial" w:hAnsi="Arial"/>
-      <w:sz w:val="15"/>
-      <w:szCs w:val="15"/>
-    </w:rPr>
-  </w:style>
-  <w:style w:customStyle="1" w:styleId="ipc_legende_tableau" w:type="paragraph">
-    <w:name w:val="ipc_legende_tableau"/>
-    <w:basedOn w:val="Normal"/>
-    <w:qFormat/>
-    <w:pPr>
-      <w:bidi/>
-      <w:spacing w:after="60" w:before="40"/>
-      <w:jc w:val="center"/>
-    </w:pPr>
-    <w:rPr>
-      <w:rFonts w:ascii="Arial" w:cs="Arial" w:eastAsia="Arial" w:hAnsi="Arial"/>
-      <w:sz w:val="15"/>
-      <w:szCs w:val="15"/>
-    </w:rPr>
   </w:style>
   <w:style w:type="paragraph" w:customStyle="1" w:styleId="SourceCode">
     <w:name w:val="Source Code"/>
@@ -11983,14 +12498,14 @@
 </file>
 
 <file path=word/theme/theme1.xml><?xml version="1.0" encoding="utf-8"?>
-<a:theme xmlns:a="http://schemas.openxmlformats.org/drawingml/2006/main" name="Office Theme">
+<a:theme xmlns:a="http://schemas.openxmlformats.org/drawingml/2006/main" xmlns:r="http://schemas.openxmlformats.org/officeDocument/2006/relationships" name="Office Theme">
   <a:themeElements>
     <a:clrScheme name="Office">
       <a:dk1>
-        <a:sysClr val="windowText" lastClr="000000"/>
+        <a:srgbClr val="000000"/>
       </a:dk1>
       <a:lt1>
-        <a:sysClr val="window" lastClr="FFFFFF"/>
+        <a:srgbClr val="FFFFFF"/>
       </a:lt1>
       <a:dk2>
         <a:srgbClr val="1F497D"/>
@@ -12025,277 +12540,131 @@
     </a:clrScheme>
     <a:fontScheme name="Office">
       <a:majorFont>
-        <a:latin typeface="Calibri"/>
+        <a:latin typeface="Calibri" pitchFamily="0" charset="1"/>
         <a:ea typeface=""/>
         <a:cs typeface=""/>
-        <a:font script="Jpan" typeface="ＭＳ ゴシック"/>
-        <a:font script="Hang" typeface="맑은 고딕"/>
-        <a:font script="Hans" typeface="宋体"/>
-        <a:font script="Hant" typeface="新細明體"/>
-        <a:font script="Arab" typeface="Times New Roman"/>
-        <a:font script="Hebr" typeface="Times New Roman"/>
-        <a:font script="Thai" typeface="Angsana New"/>
-        <a:font script="Ethi" typeface="Nyala"/>
-        <a:font script="Beng" typeface="Vrinda"/>
-        <a:font script="Gujr" typeface="Shruti"/>
-        <a:font script="Khmr" typeface="MoolBoran"/>
-        <a:font script="Knda" typeface="Tunga"/>
-        <a:font script="Guru" typeface="Raavi"/>
-        <a:font script="Cans" typeface="Euphemia"/>
-        <a:font script="Cher" typeface="Plantagenet Cherokee"/>
-        <a:font script="Yiii" typeface="Microsoft Yi Baiti"/>
-        <a:font script="Tibt" typeface="Microsoft Himalaya"/>
-        <a:font script="Thaa" typeface="MV Boli"/>
-        <a:font script="Deva" typeface="Mangal"/>
-        <a:font script="Telu" typeface="Gautami"/>
-        <a:font script="Taml" typeface="Latha"/>
-        <a:font script="Syrc" typeface="Estrangelo Edessa"/>
-        <a:font script="Orya" typeface="Kalinga"/>
-        <a:font script="Mlym" typeface="Kartika"/>
-        <a:font script="Laoo" typeface="DokChampa"/>
-        <a:font script="Sinh" typeface="Iskoola Pota"/>
-        <a:font script="Mong" typeface="Mongolian Baiti"/>
-        <a:font script="Viet" typeface="Times New Roman"/>
-        <a:font script="Uigh" typeface="Microsoft Uighur"/>
       </a:majorFont>
       <a:minorFont>
-        <a:latin typeface="Cambria"/>
+        <a:latin typeface="Cambria" pitchFamily="0" charset="1"/>
         <a:ea typeface=""/>
         <a:cs typeface=""/>
-        <a:font script="Jpan" typeface="ＭＳ 明朝"/>
-        <a:font script="Hang" typeface="맑은 고딕"/>
-        <a:font script="Hans" typeface="宋体"/>
-        <a:font script="Hant" typeface="新細明體"/>
-        <a:font script="Arab" typeface="Arial"/>
-        <a:font script="Hebr" typeface="Arial"/>
-        <a:font script="Thai" typeface="Cordia New"/>
-        <a:font script="Ethi" typeface="Nyala"/>
-        <a:font script="Beng" typeface="Vrinda"/>
-        <a:font script="Gujr" typeface="Shruti"/>
-        <a:font script="Khmr" typeface="DaunPenh"/>
-        <a:font script="Knda" typeface="Tunga"/>
-        <a:font script="Guru" typeface="Raavi"/>
-        <a:font script="Cans" typeface="Euphemia"/>
-        <a:font script="Cher" typeface="Plantagenet Cherokee"/>
-        <a:font script="Yiii" typeface="Microsoft Yi Baiti"/>
-        <a:font script="Tibt" typeface="Microsoft Himalaya"/>
-        <a:font script="Thaa" typeface="MV Boli"/>
-        <a:font script="Deva" typeface="Mangal"/>
-        <a:font script="Telu" typeface="Gautami"/>
-        <a:font script="Taml" typeface="Latha"/>
-        <a:font script="Syrc" typeface="Estrangelo Edessa"/>
-        <a:font script="Orya" typeface="Kalinga"/>
-        <a:font script="Mlym" typeface="Kartika"/>
-        <a:font script="Laoo" typeface="DokChampa"/>
-        <a:font script="Sinh" typeface="Iskoola Pota"/>
-        <a:font script="Mong" typeface="Mongolian Baiti"/>
-        <a:font script="Viet" typeface="Arial"/>
-        <a:font script="Uigh" typeface="Microsoft Uighur"/>
       </a:minorFont>
     </a:fontScheme>
-    <a:fmtScheme name="Office">
+    <a:fmtScheme>
       <a:fillStyleLst>
         <a:solidFill>
           <a:schemeClr val="phClr"/>
         </a:solidFill>
-        <a:gradFill rotWithShape="1">
+        <a:gradFill>
           <a:gsLst>
             <a:gs pos="0">
               <a:schemeClr val="phClr">
                 <a:tint val="50000"/>
-                <a:satMod val="300000"/>
               </a:schemeClr>
             </a:gs>
             <a:gs pos="35000">
               <a:schemeClr val="phClr">
                 <a:tint val="37000"/>
-                <a:satMod val="300000"/>
               </a:schemeClr>
             </a:gs>
             <a:gs pos="100000">
               <a:schemeClr val="phClr">
                 <a:tint val="15000"/>
-                <a:satMod val="350000"/>
               </a:schemeClr>
             </a:gs>
           </a:gsLst>
           <a:lin ang="16200000" scaled="1"/>
+          <a:tileRect l="0" t="0" r="0" b="0"/>
         </a:gradFill>
-        <a:gradFill rotWithShape="1">
+        <a:gradFill>
           <a:gsLst>
             <a:gs pos="0">
               <a:schemeClr val="phClr">
                 <a:tint val="100000"/>
                 <a:shade val="100000"/>
-                <a:satMod val="130000"/>
               </a:schemeClr>
             </a:gs>
             <a:gs pos="100000">
               <a:schemeClr val="phClr">
                 <a:tint val="50000"/>
                 <a:shade val="100000"/>
-                <a:satMod val="350000"/>
               </a:schemeClr>
             </a:gs>
           </a:gsLst>
           <a:lin ang="16200000" scaled="0"/>
+          <a:tileRect l="0" t="0" r="0" b="0"/>
         </a:gradFill>
       </a:fillStyleLst>
       <a:lnStyleLst>
         <a:ln w="9525" cap="flat" cmpd="sng" algn="ctr">
-          <a:solidFill>
-            <a:schemeClr val="phClr">
-              <a:shade val="95000"/>
-              <a:satMod val="105000"/>
-            </a:schemeClr>
-          </a:solidFill>
           <a:prstDash val="solid"/>
         </a:ln>
         <a:ln w="25400" cap="flat" cmpd="sng" algn="ctr">
-          <a:solidFill>
-            <a:schemeClr val="phClr"/>
-          </a:solidFill>
           <a:prstDash val="solid"/>
         </a:ln>
         <a:ln w="38100" cap="flat" cmpd="sng" algn="ctr">
-          <a:solidFill>
-            <a:schemeClr val="phClr"/>
-          </a:solidFill>
           <a:prstDash val="solid"/>
         </a:ln>
       </a:lnStyleLst>
       <a:effectStyleLst>
         <a:effectStyle>
-          <a:effectLst>
-            <a:outerShdw blurRad="40000" dist="20000" dir="5400000" rotWithShape="0">
-              <a:srgbClr val="000000">
-                <a:alpha val="38000"/>
-              </a:srgbClr>
-            </a:outerShdw>
-          </a:effectLst>
+          <a:effectLst/>
         </a:effectStyle>
         <a:effectStyle>
-          <a:effectLst>
-            <a:outerShdw blurRad="40000" dist="23000" dir="5400000" rotWithShape="0">
-              <a:srgbClr val="000000">
-                <a:alpha val="35000"/>
-              </a:srgbClr>
-            </a:outerShdw>
-          </a:effectLst>
+          <a:effectLst/>
         </a:effectStyle>
         <a:effectStyle>
-          <a:effectLst>
-            <a:outerShdw blurRad="40000" dist="23000" dir="5400000" rotWithShape="0">
-              <a:srgbClr val="000000">
-                <a:alpha val="35000"/>
-              </a:srgbClr>
-            </a:outerShdw>
-          </a:effectLst>
-          <a:scene3d>
-            <a:camera prst="orthographicFront">
-              <a:rot lat="0" lon="0" rev="0"/>
-            </a:camera>
-            <a:lightRig rig="threePt" dir="t">
-              <a:rot lat="0" lon="0" rev="1200000"/>
-            </a:lightRig>
-          </a:scene3d>
-          <a:sp3d>
-            <a:bevelT w="63500" h="25400"/>
-          </a:sp3d>
+          <a:effectLst/>
         </a:effectStyle>
       </a:effectStyleLst>
       <a:bgFillStyleLst>
         <a:solidFill>
           <a:schemeClr val="phClr"/>
         </a:solidFill>
-        <a:gradFill rotWithShape="1">
+        <a:gradFill>
           <a:gsLst>
             <a:gs pos="0">
               <a:schemeClr val="phClr">
                 <a:tint val="40000"/>
-                <a:satMod val="350000"/>
               </a:schemeClr>
             </a:gs>
             <a:gs pos="40000">
               <a:schemeClr val="phClr">
                 <a:tint val="45000"/>
                 <a:shade val="99000"/>
-                <a:satMod val="350000"/>
               </a:schemeClr>
             </a:gs>
             <a:gs pos="100000">
               <a:schemeClr val="phClr">
                 <a:shade val="20000"/>
-                <a:satMod val="255000"/>
               </a:schemeClr>
             </a:gs>
           </a:gsLst>
           <a:path path="circle">
             <a:fillToRect l="50000" t="-80000" r="50000" b="180000"/>
           </a:path>
+          <a:tileRect l="0" t="0" r="0" b="0"/>
         </a:gradFill>
-        <a:gradFill rotWithShape="1">
+        <a:gradFill>
           <a:gsLst>
             <a:gs pos="0">
               <a:schemeClr val="phClr">
                 <a:tint val="80000"/>
-                <a:satMod val="300000"/>
               </a:schemeClr>
             </a:gs>
             <a:gs pos="100000">
               <a:schemeClr val="phClr">
                 <a:shade val="30000"/>
-                <a:satMod val="200000"/>
               </a:schemeClr>
             </a:gs>
           </a:gsLst>
           <a:path path="circle">
             <a:fillToRect l="50000" t="50000" r="50000" b="50000"/>
           </a:path>
+          <a:tileRect l="0" t="0" r="0" b="0"/>
         </a:gradFill>
       </a:bgFillStyleLst>
     </a:fmtScheme>
   </a:themeElements>
-  <a:objectDefaults>
-    <a:spDef>
-      <a:spPr/>
-      <a:bodyPr/>
-      <a:lstStyle/>
-      <a:style>
-        <a:lnRef idx="1">
-          <a:schemeClr val="accent1"/>
-        </a:lnRef>
-        <a:fillRef idx="3">
-          <a:schemeClr val="accent1"/>
-        </a:fillRef>
-        <a:effectRef idx="2">
-          <a:schemeClr val="accent1"/>
-        </a:effectRef>
-        <a:fontRef idx="minor">
-          <a:schemeClr val="lt1"/>
-        </a:fontRef>
-      </a:style>
-    </a:spDef>
-    <a:lnDef>
-      <a:spPr/>
-      <a:bodyPr/>
-      <a:lstStyle/>
-      <a:style>
-        <a:lnRef idx="2">
-          <a:schemeClr val="accent1"/>
-        </a:lnRef>
-        <a:fillRef idx="0">
-          <a:schemeClr val="accent1"/>
-        </a:fillRef>
-        <a:effectRef idx="1">
-          <a:schemeClr val="accent1"/>
-        </a:effectRef>
-        <a:fontRef idx="minor">
-          <a:schemeClr val="tx1"/>
-        </a:fontRef>
-      </a:style>
-    </a:lnDef>
-  </a:objectDefaults>
-  <a:extraClrSchemeLst/>
 </a:theme>
 </file>
</xml_diff>